<commit_message>
minor changes to intro
</commit_message>
<xml_diff>
--- a/docs/manuscript/main.docx
+++ b/docs/manuscript/main.docx
@@ -7,7 +7,7 @@
         <w:pStyle w:val="Author"/>
       </w:pPr>
     </w:p>
-    <w:bookmarkStart w:id="20" w:name="abstract"/>
+    <w:bookmarkStart w:id="61" w:name="abstract"/>
     <w:p>
       <w:pPr>
         <w:pStyle w:val="Heading1"/>
@@ -53,17 +53,17 @@
         <w:br w:type="page"/>
       </w:r>
     </w:p>
-    <w:bookmarkEnd w:id="20"/>
-    <w:bookmarkStart w:id="25" w:name="cool-title"/>
+    <w:bookmarkEnd w:id="61"/>
+    <w:bookmarkStart w:id="66" w:name="X36463548a04de6319da6edd030beba8389aa50d"/>
     <w:p>
       <w:pPr>
         <w:pStyle w:val="Heading1"/>
       </w:pPr>
       <w:r>
-        <w:t xml:space="preserve">Cool Title</w:t>
+        <w:t xml:space="preserve">Cumulative Cognate Facilitation in L3 Spanish: Evidence in Accuracy but Not Speed</w:t>
       </w:r>
     </w:p>
-    <w:bookmarkStart w:id="21" w:name="introduction"/>
+    <w:bookmarkStart w:id="62" w:name="introduction"/>
     <w:p>
       <w:pPr>
         <w:pStyle w:val="Heading2"/>
@@ -106,7 +106,7 @@
         <w:pStyle w:val="BodyText"/>
       </w:pPr>
       <w:r>
-        <w:t xml:space="preserve">Bilingualism being the norm suggests that it is also the more common initial state for subsequent language learning relative to monolingualism.</w:t>
+        <w:t xml:space="preserve">The prevalence of bilingualism relative to monolingualism suggests that bilingualism is also a common starting point for subsequent language learning.</w:t>
       </w:r>
       <w:r>
         <w:t xml:space="preserve"> </w:t>
@@ -118,7 +118,7 @@
         <w:t xml:space="preserve"> </w:t>
       </w:r>
       <w:r>
-        <w:t xml:space="preserve">Yet, despite the prevalence of multilingual language learning, we know remarkably little about how third (L3) and additional (Ln) languages are acquired and processed relative to true second language (L2) learning.</w:t>
+        <w:t xml:space="preserve">Yet, despite the prevalence of multilingual language learning, we know remarkably little about how third (L3) and additional (Ln) languages are acquired and processed relative to second language (L2) learning.</w:t>
       </w:r>
       <w:r>
         <w:t xml:space="preserve"> </w:t>
@@ -132,31 +132,22 @@
         <w:pStyle w:val="BodyText"/>
       </w:pPr>
       <w:r>
-        <w:t xml:space="preserve">Whether or not L3 and L2 learning are indeed distinct has, though somewhat indirectly, been a point of contention in L3 models via the wholesale transfer/property-by-property transfer debate.</w:t>
-      </w:r>
-      <w:r>
-        <w:t xml:space="preserve"> </w:t>
-      </w:r>
-      <w:r>
-        <w:t xml:space="preserve">In the former, articulated by Rothman and colleagues</w:t>
-      </w:r>
-      <w:r>
-        <w:t xml:space="preserve"> </w:t>
-      </w:r>
-      <w:r>
-        <w:t xml:space="preserve">(Rothman, 2015; Rothman, Alonso, &amp; Puig-Mayenco, 2019)</w:t>
-      </w:r>
-      <w:r>
-        <w:t xml:space="preserve">, and more recently</w:t>
-      </w:r>
-      <w:r>
-        <w:t xml:space="preserve"> </w:t>
-      </w:r>
-      <w:r>
-        <w:t xml:space="preserve">Sprouse &amp; Schwartz (2023)</w:t>
-      </w:r>
-      <w:r>
-        <w:t xml:space="preserve">, either the L1 or L2 transfers to the L3 early in development, suggesting that when L3 learners transfer the L1, L3 and L2 learning would be in principle the same process in that both learner types (L2 or L3) would be guided by their L1.</w:t>
+        <w:t xml:space="preserve">Whether L3 and L2 learning are indeed distinct has been addressed, though somewhat indirectly, in debates over wholesale transfer versus property-by-property transfer.</w:t>
+      </w:r>
+      <w:r>
+        <w:t xml:space="preserve"> </w:t>
+      </w:r>
+      <w:r>
+        <w:t xml:space="preserve">In wholesale transfer accounts</w:t>
+      </w:r>
+      <w:r>
+        <w:t xml:space="preserve"> </w:t>
+      </w:r>
+      <w:r>
+        <w:t xml:space="preserve">(e.g., Rothman, Alonso, &amp; Puig-Mayenco, 2019; Rothman, 2015; Sprouse &amp; Schwartz, 2023)</w:t>
+      </w:r>
+      <w:r>
+        <w:t xml:space="preserve">, either the L1 or L2 transfers to the L3 early in development, suggesting that when L3 learners transfer the L1, L3 and L2 learning would involve, in principle, the same process in that both learner types (L2 or L3) would be guided by their L1.</w:t>
       </w:r>
       <w:r>
         <w:t xml:space="preserve"> </w:t>
@@ -201,7 +192,7 @@
         <w:t xml:space="preserve"> </w:t>
       </w:r>
       <w:r>
-        <w:t xml:space="preserve">(Cabrelli, Amaro, &amp; Rothman, 2015; Giancaspro, Halloran, &amp; Iverson, 2015; Ionin, Grolla, Santos, &amp; Montrul, 2015, 2015; Montrul, Dias, &amp; Santos, 2011; Parma, 2017)</w:t>
+        <w:t xml:space="preserve">(Cabrelli, Amaro, &amp; Rothman, 2015; Giancaspro, Halloran, &amp; Iverson, 2015; Ionin, Grolla, Santos, &amp; Montrul, 2015; Montrul, Dias, &amp; Santos, 2011; Parma, 2017)</w:t>
       </w:r>
       <w:r>
         <w:t xml:space="preserve">, while further studies found evidence for typological transfer in other language combinations</w:t>
@@ -211,6 +202,9 @@
       </w:r>
       <w:r>
         <w:t xml:space="preserve">(Garavito &amp; Perpiñán, 2014; Garcı́a Mayo &amp; Slabakova, 2015; Puig-Mayenco, Miller, &amp; Rothman, 2018)</w:t>
+      </w:r>
+      <w:r>
+        <w:t xml:space="preserve">.</w:t>
       </w:r>
     </w:p>
     <w:p>
@@ -218,7 +212,7 @@
         <w:pStyle w:val="BodyText"/>
       </w:pPr>
       <w:r>
-        <w:t xml:space="preserve">Property-by-property views of L3 acquisition, on the other hand, have argued that transfer is not wholesale, and L3 speakers retain access to both L1 and L2 linguistic representations</w:t>
+        <w:t xml:space="preserve">Property-by-property views, in contrast, argue that transfer is not wholesale, and L3 speakers retain access to both L1 and L2 linguistic representations</w:t>
       </w:r>
       <w:r>
         <w:t xml:space="preserve"> </w:t>
@@ -278,7 +272,7 @@
         <w:t xml:space="preserve"> </w:t>
       </w:r>
       <w:r>
-        <w:t xml:space="preserve">Additional studies also reported differences in crosslinguistic influence between L3 and L2 learners in L3 English</w:t>
+        <w:t xml:space="preserve">Additional studies also reported differences in cross-linguistic influence between L3 and L2 learners in L3 English</w:t>
       </w:r>
       <w:r>
         <w:t xml:space="preserve"> </w:t>
@@ -311,7 +305,7 @@
         <w:t xml:space="preserve"> </w:t>
       </w:r>
       <w:r>
-        <w:t xml:space="preserve">Studies in property-by-property influence, on the other hand, provide evidence that although L3 learners can be primarily influence by their L1, they also experience relative degrees of additional L2 influence that meaningfully differentiates them from L2 learners.</w:t>
+        <w:t xml:space="preserve">Studies in property-by-property influence, on the other hand, provide evidence that although L3 learners can be primarily influenced by their L1, they also experience relative degrees of additional L2 influence that meaningfully differentiates them from L2 learners.</w:t>
       </w:r>
     </w:p>
     <w:p>
@@ -319,7 +313,7 @@
         <w:pStyle w:val="BodyText"/>
       </w:pPr>
       <w:r>
-        <w:t xml:space="preserve">As a result, in order to inform how and whether L2 and L3 learning follow distinct trajectories, it becomes necessary not to simply show that speakers have access to the L1 or L2, but rather to what degree both are active at a given time.</w:t>
+        <w:t xml:space="preserve">As a result, in order to inform how and whether L2 and L3 learning follow distinct trajectories, it becomes necessary not to simply show that speakers have access to the L1 or L2, but rather examine the degree to which both are active at a given time.</w:t>
       </w:r>
       <w:r>
         <w:t xml:space="preserve"> </w:t>
@@ -337,29 +331,35 @@
         <w:t xml:space="preserve"> </w:t>
       </w:r>
       <w:r>
-        <w:t xml:space="preserve">Vitally, the within-subjects design allows for the testing of a cumulative effect by comparing the processing of double cognates (words present in the L2 and L3) to triple cognates (words present in all three languages), which, if present, would imply that L2 and L3 learning are distinct processes.</w:t>
-      </w:r>
-      <w:r>
-        <w:t xml:space="preserve"> </w:t>
-      </w:r>
-      <w:r>
-        <w:t xml:space="preserve">Specifically, if L1 German-L2 English-L3 Spanish speakers process triple cognates faster than double cognates (L2 English-L3 Spanish), it would suggest they retain access to both their L1 German and L2 English.</w:t>
-      </w:r>
-      <w:r>
-        <w:t xml:space="preserve"> </w:t>
-      </w:r>
-      <w:r>
-        <w:t xml:space="preserve">On the other hand, if both double and triple cognates are processed at a similar speed (and are faster than non-cognates), this would suggest that these speakers inhibit their L1 lexical knowledge in L3 Spanish.</w:t>
-      </w:r>
-      <w:r>
-        <w:t xml:space="preserve"> </w:t>
-      </w:r>
-      <w:r>
-        <w:t xml:space="preserve">Finally, if non-cognates and double cognates are processed at similar speed, but triple cognates are processed faster, this would suggest that L2 knowledge is inhibited (supporting similar lexical processing in general in L2 and L3 learners).</w:t>
+        <w:t xml:space="preserve">Importantly, the within-subjects design allows for the testing of a cumulative effect by comparing the processing of double cognates (words present in the L2 and L3) with triple cognates (words present in all three languages).</w:t>
+      </w:r>
+      <w:r>
+        <w:t xml:space="preserve"> </w:t>
+      </w:r>
+      <w:r>
+        <w:t xml:space="preserve">If such a cumulative effect is present, it would suggest that both previously acquired languages remain active during L3 processing.</w:t>
+      </w:r>
+      <w:r>
+        <w:t xml:space="preserve"> </w:t>
+      </w:r>
+      <w:r>
+        <w:t xml:space="preserve">Specifically, if triple cognates are processed faster than double cognates (L2 English-L3 Spanish), it would indicate that both L1 German and L2 English are involved during L3 processing.</w:t>
+      </w:r>
+      <w:r>
+        <w:t xml:space="preserve"> </w:t>
+      </w:r>
+      <w:r>
+        <w:t xml:space="preserve">If both double and triple cognates are processed similarly, but both faster than noncognates, this would suggest no additional benefit from overlap with L1 German.</w:t>
+      </w:r>
+      <w:r>
+        <w:t xml:space="preserve"> </w:t>
+      </w:r>
+      <w:r>
+        <w:t xml:space="preserve">Finally, if triple cognates are faster than both double cognates and noncognates, while double cognates do not differ from noncognates, this would suggest limited influence from L2 English.</w:t>
       </w:r>
     </w:p>
-    <w:bookmarkEnd w:id="21"/>
-    <w:bookmarkStart w:id="22" w:name="Xa0ef4976aa743d69b4075c856f1c3e29387e3e9"/>
+    <w:bookmarkEnd w:id="62"/>
+    <w:bookmarkStart w:id="63" w:name="Xa0ef4976aa743d69b4075c856f1c3e29387e3e9"/>
     <w:p>
       <w:pPr>
         <w:pStyle w:val="Heading2"/>
@@ -393,7 +393,7 @@
         <w:pStyle w:val="BodyText"/>
       </w:pPr>
       <w:r>
-        <w:t xml:space="preserve">Research on bilingual populations using a wide range of experimental tasks has consistently observed robust cognate facilitation effects in word recognition in the visual and aural modality as well as in language production.</w:t>
+        <w:t xml:space="preserve">Research on bilingual populations using a wide range of experimental tasks has consistently observed robust cognate facilitation effects in word recognition in both visual and auditory modalities as well as in language production.</w:t>
       </w:r>
       <w:r>
         <w:t xml:space="preserve"> </w:t>
@@ -426,10 +426,7 @@
         <w:t xml:space="preserve">(Cop, Drieghe, &amp; Duyck, 2015)</w:t>
       </w:r>
       <w:r>
-        <w:t xml:space="preserve"> </w:t>
-      </w:r>
-      <w:r>
-        <w:t xml:space="preserve">and writing</w:t>
+        <w:t xml:space="preserve">, and writing</w:t>
       </w:r>
       <w:r>
         <w:t xml:space="preserve"> </w:t>
@@ -447,7 +444,7 @@
         <w:t xml:space="preserve"> </w:t>
       </w:r>
       <w:r>
-        <w:t xml:space="preserve">However, cognates have also been found to be a source of cross-linguistic interference</w:t>
+        <w:t xml:space="preserve">However, cognates can also be a source of cross-linguistic interference</w:t>
       </w:r>
       <w:r>
         <w:t xml:space="preserve"> </w:t>
@@ -468,7 +465,13 @@
         <w:t xml:space="preserve">(e.g., Dijkstra, Miwa, Brummelhuis, Sappelli, &amp; Baayen, 2010; Frances, Navarra-Barindelli, &amp; Martin, 2021, 2022)</w:t>
       </w:r>
       <w:r>
-        <w:t xml:space="preserve">, indicating that cognate processing is not uniformly facilitative but instead reflects complex, context-dependent interactions across languages.</w:t>
+        <w:t xml:space="preserve">.</w:t>
+      </w:r>
+      <w:r>
+        <w:t xml:space="preserve"> </w:t>
+      </w:r>
+      <w:r>
+        <w:t xml:space="preserve">Thus, cognates do not uniformly facilitate processing but instead give rise to complex, context-dependent interactions across languages.</w:t>
       </w:r>
     </w:p>
     <w:p>
@@ -482,7 +485,7 @@
         <w:t xml:space="preserve"> </w:t>
       </w:r>
       <w:r>
-        <w:t xml:space="preserve">At the linguistic level, the degree of cross-linguistic form overlap plays a central role in the cognate facilitation effect</w:t>
+        <w:t xml:space="preserve">At the linguistic level, the degree of cross-linguistic form overlap affects the magnitude of the cognate facilitation effect</w:t>
       </w:r>
       <w:r>
         <w:t xml:space="preserve"> </w:t>
@@ -521,7 +524,7 @@
         <w:t xml:space="preserve"> </w:t>
       </w:r>
       <w:r>
-        <w:t xml:space="preserve">generally facilitate lexical processing; though in certain contexts orthographic and phonological similarity may have different roles depending on the modality of the experimental task</w:t>
+        <w:t xml:space="preserve">generally facilitate lexical processing, although their respective roles may vary depending on task modality</w:t>
       </w:r>
       <w:r>
         <w:t xml:space="preserve"> </w:t>
@@ -536,7 +539,7 @@
         <w:t xml:space="preserve"> </w:t>
       </w:r>
       <w:r>
-        <w:t xml:space="preserve">In addition, lexical frequency also modulates the strength of cognate effects, with high-frequency cognates yielding faster and more accurate recognition than low-frequency cognates</w:t>
+        <w:t xml:space="preserve">In addition, lexical frequency modulates the strength of cognate effects, with high-frequency cognates yielding faster and more accurate recognition than low-frequency cognates</w:t>
       </w:r>
       <w:r>
         <w:t xml:space="preserve"> </w:t>
@@ -580,13 +583,13 @@
         <w:pStyle w:val="BodyText"/>
       </w:pPr>
       <w:r>
-        <w:t xml:space="preserve">Task-related factors further shape cognate effects, as such effects are sensitive to the composition of the stimulus list.</w:t>
-      </w:r>
-      <w:r>
-        <w:t xml:space="preserve"> </w:t>
-      </w:r>
-      <w:r>
-        <w:t xml:space="preserve">The strength of the cognate effect can decrease with the absence of identical cognates in the input</w:t>
+        <w:t xml:space="preserve">Cognate effects are also shaped by task-related factors, such as the composition of the stimulus list.</w:t>
+      </w:r>
+      <w:r>
+        <w:t xml:space="preserve"> </w:t>
+      </w:r>
+      <w:r>
+        <w:t xml:space="preserve">Cognate effects are less likely to be observed when identical cognates are not included in the input</w:t>
       </w:r>
       <w:r>
         <w:t xml:space="preserve"> </w:t>
@@ -598,7 +601,7 @@
         <w:t xml:space="preserve"> </w:t>
       </w:r>
       <w:r>
-        <w:t xml:space="preserve">or with the inclusion of more varied lexical items</w:t>
+        <w:t xml:space="preserve">or when the input contains a large variety of lexical items</w:t>
       </w:r>
       <w:r>
         <w:t xml:space="preserve"> </w:t>
@@ -613,7 +616,7 @@
         <w:t xml:space="preserve"> </w:t>
       </w:r>
       <w:r>
-        <w:t xml:space="preserve">Similarly, variations in task demands influence cognate effects as different tasks tap into different levels of processing and may require different cognitive mechanisms.</w:t>
+        <w:t xml:space="preserve">Task demands also influence cognate effects because different tasks tap into different levels of processing and may require different cognitive mechanisms.</w:t>
       </w:r>
       <w:r>
         <w:t xml:space="preserve"> </w:t>
@@ -643,7 +646,13 @@
         <w:t xml:space="preserve"> </w:t>
       </w:r>
       <w:r>
-        <w:t xml:space="preserve">Moreover, speaker-specific factors like language proficiency and experience modulate the extent to which cognates facilitate or inhibit processing, with less proficient speakers often benefiting more from increased cross-linguistic similarity than more proficient speakers</w:t>
+        <w:t xml:space="preserve">Moreover, speaker-specific factors such as language proficiency and experience modulate the extent to which cognates facilitate or inhibit processing.</w:t>
+      </w:r>
+      <w:r>
+        <w:t xml:space="preserve"> </w:t>
+      </w:r>
+      <w:r>
+        <w:t xml:space="preserve">Less proficient speakers often benefit more from increased cross-linguistic similarity than more proficient speakers</w:t>
       </w:r>
       <w:r>
         <w:t xml:space="preserve"> </w:t>
@@ -658,7 +667,7 @@
         <w:t xml:space="preserve"> </w:t>
       </w:r>
       <w:r>
-        <w:t xml:space="preserve">Other individual differences such as speaker accent</w:t>
+        <w:t xml:space="preserve">Other individual differences, including speaker accent</w:t>
       </w:r>
       <w:r>
         <w:t xml:space="preserve"> </w:t>
@@ -679,10 +688,7 @@
         <w:t xml:space="preserve">(Carrasco-Ortiz et al., 2021)</w:t>
       </w:r>
       <w:r>
-        <w:t xml:space="preserve"> </w:t>
-      </w:r>
-      <w:r>
-        <w:t xml:space="preserve">also interact with the effects of increased cross-linguistic similarity.</w:t>
+        <w:t xml:space="preserve">, have also been shown to interact with cross-linguistic similarity.</w:t>
       </w:r>
       <w:r>
         <w:t xml:space="preserve"> </w:t>
@@ -694,8 +700,8 @@
         <w:t xml:space="preserve"> </w:t>
       </w:r>
     </w:p>
-    <w:bookmarkEnd w:id="22"/>
-    <w:bookmarkStart w:id="23" w:name="X1b13b08d22823258dbc3e067a58ea940446a5d8"/>
+    <w:bookmarkEnd w:id="63"/>
+    <w:bookmarkStart w:id="64" w:name="X1b13b08d22823258dbc3e067a58ea940446a5d8"/>
     <w:p>
       <w:pPr>
         <w:pStyle w:val="Heading2"/>
@@ -745,7 +751,7 @@
         <w:t xml:space="preserve"> </w:t>
       </w:r>
       <w:r>
-        <w:t xml:space="preserve">While empirical evidence supports both hypotheses,</w:t>
+        <w:t xml:space="preserve">While empirical evidence supports both hypotheses, a systematic review by</w:t>
       </w:r>
       <w:r>
         <w:t xml:space="preserve"> </w:t>
@@ -754,13 +760,16 @@
         <w:t xml:space="preserve">Puig-Mayenco, González Alonso, &amp; Rothman (2020b)</w:t>
       </w:r>
       <w:r>
-        <w:t xml:space="preserve">’s systematic review showed that a vast majority of transfer studies in L3 acquisition provided supporting evidence for one-to-one transfer.</w:t>
-      </w:r>
-      <w:r>
-        <w:t xml:space="preserve"> </w:t>
-      </w:r>
-      <w:r>
-        <w:t xml:space="preserve">Though, most of the evidence addresses L3 morphosyntax, and research on L3 lexical acquisition remains scarce.</w:t>
+        <w:t xml:space="preserve"> </w:t>
+      </w:r>
+      <w:r>
+        <w:t xml:space="preserve">showed that a vast majority of transfer studies in L3 acquisition provided supporting evidence for one-to-one transfer.</w:t>
+      </w:r>
+      <w:r>
+        <w:t xml:space="preserve"> </w:t>
+      </w:r>
+      <w:r>
+        <w:t xml:space="preserve">However, most of the evidence addresses L3 morphosyntax, and research on L3 lexical acquisition remains scarce.</w:t>
       </w:r>
     </w:p>
     <w:p>
@@ -801,7 +810,7 @@
         <w:t xml:space="preserve"> </w:t>
       </w:r>
       <w:r>
-        <w:t xml:space="preserve">Importantly, novel words receive a benefit to learning if they overlap with at least one of the previously acquired languages, with no additional benefit for overlapping with both languages.</w:t>
+        <w:t xml:space="preserve">Importantly, novel words receive a learning benefit if they overlap with at least one of the previously acquired languages, with no additional benefit for overlapping with both.</w:t>
       </w:r>
       <w:r>
         <w:t xml:space="preserve"> </w:t>
@@ -834,7 +843,7 @@
         <w:t xml:space="preserve">(Ecke, 2015)</w:t>
       </w:r>
       <w:r>
-        <w:t xml:space="preserve">, in which novel L3 words attach to a L1 or L2 host to facilitate learning.</w:t>
+        <w:t xml:space="preserve">, in which novel L3 words attach to an L1 or L2 host to facilitate learning.</w:t>
       </w:r>
       <w:r>
         <w:t xml:space="preserve"> </w:t>
@@ -864,7 +873,7 @@
         <w:t xml:space="preserve"> </w:t>
       </w:r>
       <w:r>
-        <w:t xml:space="preserve">Overall, both models highlight the role of cross-linguistic similarity, but they differ on which source exerts the influence on L3.</w:t>
+        <w:t xml:space="preserve">Overall, both models highlight the role of cross-linguistic similarity, but they differ in whether facilitation is cumulative across previously acquired languages.</w:t>
       </w:r>
     </w:p>
     <w:p>
@@ -890,7 +899,7 @@
         <w:t xml:space="preserve"> </w:t>
       </w:r>
       <w:r>
-        <w:t xml:space="preserve">Triple cognates and double cognates improved lexical learning in a similar way compared to noncognates.</w:t>
+        <w:t xml:space="preserve">Double and triple cognates facilitated lexical learning to a similar extent relative to noncognates.</w:t>
       </w:r>
       <w:r>
         <w:t xml:space="preserve"> </w:t>
@@ -904,7 +913,7 @@
         <w:pStyle w:val="BodyText"/>
       </w:pPr>
       <w:r>
-        <w:t xml:space="preserve">Further evidence in L3 lexical processing has provided mixed findings regarding the source of cross-linguistic influence.</w:t>
+        <w:t xml:space="preserve">Further evidence in L3 lexical processing has yielded mixed findings.</w:t>
       </w:r>
       <w:r>
         <w:t xml:space="preserve"> </w:t>
@@ -958,13 +967,7 @@
         <w:t xml:space="preserve"> </w:t>
       </w:r>
       <w:r>
-        <w:t xml:space="preserve">Results showed no facilitation effects of triple cognates.</w:t>
-      </w:r>
-      <w:r>
-        <w:t xml:space="preserve"> </w:t>
-      </w:r>
-      <w:r>
-        <w:t xml:space="preserve">Results also indicated that cognate processing was not affected by the sentence context, unlike noncognates.</w:t>
+        <w:t xml:space="preserve">Results showed no facilitation effects for triple cognates and indicated that sentence context did not modulate cognate processing, unlike noncognate processing.</w:t>
       </w:r>
       <w:r>
         <w:t xml:space="preserve"> </w:t>
@@ -988,13 +991,13 @@
         <w:t xml:space="preserve"> </w:t>
       </w:r>
       <w:r>
-        <w:t xml:space="preserve">The results of two lexical decision tasks in Dutch containing double cognates (Polish-Dutch and English-Dutch) and triple cognates revealed facilitation effects for triple cognates and for English-Dutch cognates but not for Polish-Dutch cognates.</w:t>
-      </w:r>
-      <w:r>
-        <w:t xml:space="preserve"> </w:t>
-      </w:r>
-      <w:r>
-        <w:t xml:space="preserve">Their findings showed a stronger influence of L2 than L1 in L3 processing, but evidence of an additive effect of cross-linguistic similarity was inconclusive because double and triple cognates were separated among the two tasks.</w:t>
+        <w:t xml:space="preserve">Two lexical decision tasks in Dutch revealed facilitation effects for triple cognates and for English-Dutch cognates, but not for Polish-Dutch cognates.</w:t>
+      </w:r>
+      <w:r>
+        <w:t xml:space="preserve"> </w:t>
+      </w:r>
+      <w:r>
+        <w:t xml:space="preserve">These findings suggest a stronger L2 than L1 influence, although evidence for an additive effect of cross-linguistic similarity remained inconclusive because double and triple cognates were distributed across the two tasks.</w:t>
       </w:r>
       <w:r>
         <w:t xml:space="preserve"> </w:t>
@@ -1062,7 +1065,7 @@
         <w:t xml:space="preserve"> </w:t>
       </w:r>
       <w:r>
-        <w:t xml:space="preserve">Results showed robust cognate facilitation effects for double and triple cognates, but a stronger facilitation effect was observed for triple cognates compared to double cognates.</w:t>
+        <w:t xml:space="preserve">Results showed robust cognate facilitation effects for double and triple cognates, but a stronger facilitation effect was observed for triple cognates than double cognates.</w:t>
       </w:r>
       <w:r>
         <w:t xml:space="preserve"> </w:t>
@@ -1086,7 +1089,7 @@
         <w:t xml:space="preserve"> </w:t>
       </w:r>
       <w:r>
-        <w:t xml:space="preserve">The results of two lexical decision tasks including double cognates (Polish-German), triple cognates, and noncognates revealed additive effects of cross-linguistic similarity in both L1 and L3 lexical processing.</w:t>
+        <w:t xml:space="preserve">Two lexical decision tasks containing double cognates (Polish-German), triple cognates, and noncognates revealed additive effects of cross-linguistic similarity in both L1 and L3 lexical processing.</w:t>
       </w:r>
       <w:r>
         <w:t xml:space="preserve"> </w:t>
@@ -1172,7 +1175,7 @@
         <w:pStyle w:val="BodyText"/>
       </w:pPr>
       <w:r>
-        <w:t xml:space="preserve">The findings of the studies described above mainly expand in two directions, providing supporting evidence for the Scaffolding model</w:t>
+        <w:t xml:space="preserve">The findings of the studies described above generally fall into two patterns, supporting either the Scaffolding model</w:t>
       </w:r>
       <w:r>
         <w:t xml:space="preserve"> </w:t>
@@ -1196,7 +1199,7 @@
         <w:t xml:space="preserve"> </w:t>
       </w:r>
       <w:r>
-        <w:t xml:space="preserve">or supporting the Accumulation model</w:t>
+        <w:t xml:space="preserve">or the Accumulation model</w:t>
       </w:r>
       <w:r>
         <w:t xml:space="preserve"> </w:t>
@@ -1223,7 +1226,13 @@
         <w:t xml:space="preserve"> </w:t>
       </w:r>
       <w:r>
-        <w:t xml:space="preserve">In addition, available evidence is mixed with regards to the nature of cross-linguistic interactions in multilingual contexts, with some studies reporting stronger influence from the L2 than the L1, which aligns with the L2-status factor</w:t>
+        <w:t xml:space="preserve">Available evidence is mixed with regard to the source of cross-linguistic influence in multilingual contexts.</w:t>
+      </w:r>
+      <w:r>
+        <w:t xml:space="preserve"> </w:t>
+      </w:r>
+      <w:r>
+        <w:t xml:space="preserve">Some studies report stronger effects from the L2 than the L1, consistent with the L2-status factor</w:t>
       </w:r>
       <w:r>
         <w:t xml:space="preserve"> </w:t>
@@ -1232,7 +1241,7 @@
         <w:t xml:space="preserve">(Bardel &amp; Falk, 2007, 2012)</w:t>
       </w:r>
       <w:r>
-        <w:t xml:space="preserve">, and other studies showing more influence from the L1</w:t>
+        <w:t xml:space="preserve">, whereas others report stronger L1 influence</w:t>
       </w:r>
       <w:r>
         <w:t xml:space="preserve"> </w:t>
@@ -1253,19 +1262,7 @@
         <w:t xml:space="preserve"> </w:t>
       </w:r>
       <w:r>
-        <w:t xml:space="preserve">Some studies suggest that</w:t>
-      </w:r>
-      <w:r>
-        <w:t xml:space="preserve"> </w:t>
-      </w:r>
-      <w:r>
-        <w:t xml:space="preserve">“sufficient”</w:t>
-      </w:r>
-      <w:r>
-        <w:t xml:space="preserve"> </w:t>
-      </w:r>
-      <w:r>
-        <w:t xml:space="preserve">proficiency is needed for cumulative cognate effects to emerge</w:t>
+        <w:t xml:space="preserve">Some studies suggest that a sufficient level of proficiency is needed for cumulative cognate effects to emerge</w:t>
       </w:r>
       <w:r>
         <w:t xml:space="preserve"> </w:t>
@@ -1274,13 +1271,13 @@
         <w:t xml:space="preserve">(e.g., Lemhöfer et al., 2004; Poarch &amp; Hell, 2014; Szubko-Sitarek, 2011)</w:t>
       </w:r>
       <w:r>
-        <w:t xml:space="preserve">, though it is very complex to establish such a threshold in multilingual individuals.</w:t>
-      </w:r>
-      <w:r>
-        <w:t xml:space="preserve"> </w:t>
-      </w:r>
-      <w:r>
-        <w:t xml:space="preserve">The present study further explores the influence of cross-linguistic similarity in L3 lexical processing by examining cumulative cognate effects in L3 Spanish, a less represented language in the L3 literature.</w:t>
+        <w:t xml:space="preserve">, although establishing such a threshold in multilingual speakers is difficult.</w:t>
+      </w:r>
+      <w:r>
+        <w:t xml:space="preserve"> </w:t>
+      </w:r>
+      <w:r>
+        <w:t xml:space="preserve">The present study further explores the influence of cross-linguistic similarity in L3 lexical processing by examining cumulative cognate effects in L3 Spanish, an underrepresented language in the L3 literature.</w:t>
       </w:r>
       <w:r>
         <w:t xml:space="preserve"> </w:t>
@@ -1289,8 +1286,8 @@
         <w:t xml:space="preserve">In doing so, we aim to advance our understanding of the interactions and contributions of previously acquired languages in L3 processing.</w:t>
       </w:r>
     </w:p>
-    <w:bookmarkEnd w:id="23"/>
-    <w:bookmarkStart w:id="24" w:name="the-present-study"/>
+    <w:bookmarkEnd w:id="64"/>
+    <w:bookmarkStart w:id="65" w:name="the-present-study"/>
     <w:p>
       <w:pPr>
         <w:pStyle w:val="Heading2"/>
@@ -1461,21 +1458,6 @@
       <w:r>
         <w:t xml:space="preserve">.</w:t>
       </w:r>
-      <w:r>
-        <w:t xml:space="preserve"> </w:t>
-      </w:r>
-      <w:r>
-        <w:t xml:space="preserve">Finally, a third possibility is that triple cognates are processed more efficiently than both double cognates and non-cognates.</w:t>
-      </w:r>
-      <w:r>
-        <w:t xml:space="preserve"> </w:t>
-      </w:r>
-      <w:r>
-        <w:t xml:space="preserve">This finding would support the inhibition of L2 lexical items and support an L1-prominent view.</w:t>
-      </w:r>
-      <w:r>
-        <w:t xml:space="preserve"> </w:t>
-      </w:r>
     </w:p>
     <w:p>
       <w:pPr>
@@ -1488,7 +1470,7 @@
         <w:t xml:space="preserve"> </w:t>
       </w:r>
       <w:r>
-        <w:t xml:space="preserve">While the role of proficiency remains to be further explored, available studies suggest that a sufficient level of proficiency is needed for cumulative cognate effects to emerge and that lower proficiency trilinguals do not have the necessary level of co-activation to produce cumulative effects across the three languages</w:t>
+        <w:t xml:space="preserve">While the role of proficiency remains to be further explored, available studies suggest that a sufficient level of proficiency is needed for cumulative cognate effects to emerge and that low-proficiency trilinguals do not have the necessary level of co-activation to produce cumulative effects across the three languages</w:t>
       </w:r>
       <w:r>
         <w:t xml:space="preserve"> </w:t>
@@ -1503,12 +1485,12 @@
         <w:t xml:space="preserve"> </w:t>
       </w:r>
       <w:r>
-        <w:t xml:space="preserve">Following this evidence, in the present study, higher L3 proficiency may be associated with stronger co-activation of cognates, resulting in stronger cognate effects.</w:t>
+        <w:t xml:space="preserve">Following this evidence, in the present study, higher L3 proficiency is expected to be associated with stronger co-activation of cognates, resulting in stronger cognate effects.</w:t>
       </w:r>
     </w:p>
-    <w:bookmarkEnd w:id="24"/>
-    <w:bookmarkEnd w:id="25"/>
-    <w:bookmarkStart w:id="34" w:name="methodology"/>
+    <w:bookmarkEnd w:id="65"/>
+    <w:bookmarkEnd w:id="66"/>
+    <w:bookmarkStart w:id="75" w:name="methodology"/>
     <w:p>
       <w:pPr>
         <w:pStyle w:val="Heading1"/>
@@ -1517,7 +1499,7 @@
         <w:t xml:space="preserve">Methodology</w:t>
       </w:r>
     </w:p>
-    <w:bookmarkStart w:id="26" w:name="participants"/>
+    <w:bookmarkStart w:id="67" w:name="participants"/>
     <w:p>
       <w:pPr>
         <w:pStyle w:val="Heading2"/>
@@ -1537,7 +1519,7 @@
         <w:t xml:space="preserve"> </w:t>
       </w:r>
       <w:r>
-        <w:t xml:space="preserve">A total of nine participants were recruited from Hispanic Linguistics courses in a public university in Frankfurt, Germany.</w:t>
+        <w:t xml:space="preserve">A total of nine participants were recruited from Hispanic Linguistics courses at a public university in Frankfurt, Germany.</w:t>
       </w:r>
       <w:r>
         <w:t xml:space="preserve"> </w:t>
@@ -1590,7 +1572,7 @@
         <w:t xml:space="preserve"> </w:t>
       </w:r>
       <w:r>
-        <w:t xml:space="preserve">The survey contained 23 total questions, including general information (age, gender, birth place and place of residence), language dominance and order of acquisition, and self-rated proficiency in both speaking and perception.</w:t>
+        <w:t xml:space="preserve">The survey contained 23 total questions including general information (age, gender, birthplace, and place of residence), language dominance, order of acquisition, and self-rated proficiency for both productive and receptive skills.</w:t>
       </w:r>
     </w:p>
     <w:p>
@@ -1610,19 +1592,31 @@
         <w:t xml:space="preserve"> </w:t>
       </w:r>
       <w:r>
-        <w:t xml:space="preserve">All participants reported that their first language was German, that English was their second language and that Spanish was their third language, both in terms of order of acquisition and dominance.</w:t>
-      </w:r>
-      <w:r>
-        <w:t xml:space="preserve"> </w:t>
-      </w:r>
-      <w:r>
-        <w:t xml:space="preserve">The mean age of onset of English was 8.8 (sd = 2) and the age of acquisition (when participants first felt fluent) was 16.6 (sd = 3.5).</w:t>
-      </w:r>
-      <w:r>
-        <w:t xml:space="preserve"> </w:t>
-      </w:r>
-      <w:r>
-        <w:t xml:space="preserve">The mean age of onset for Spanish was 18 (sd = 9.6), and the mean age of acquisition was 22.1 (sd = 5), although many participants did not enter a value in the survey for age of acquisition of Spanish.</w:t>
+        <w:t xml:space="preserve">All participants reported German as their first language, English as their second language, and Spanish as their third language.</w:t>
+      </w:r>
+      <w:r>
+        <w:t xml:space="preserve"> </w:t>
+      </w:r>
+      <w:r>
+        <w:t xml:space="preserve">This order applied both to acquisition and language dominance.</w:t>
+      </w:r>
+      <w:r>
+        <w:t xml:space="preserve"> </w:t>
+      </w:r>
+      <w:r>
+        <w:t xml:space="preserve">The mean age of onset of English was 8.8 (sd = 2) and the mean age of acquisition (when participants first felt fluent) was 16.6 (sd = 3.5).</w:t>
+      </w:r>
+      <w:r>
+        <w:t xml:space="preserve"> </w:t>
+      </w:r>
+      <w:r>
+        <w:t xml:space="preserve">The mean age of onset for Spanish was 18 (sd = 9.6), and the mean age of acquisition was 22.1 (sd = 5).</w:t>
+      </w:r>
+      <w:r>
+        <w:t xml:space="preserve"> </w:t>
+      </w:r>
+      <w:r>
+        <w:t xml:space="preserve">However, many participants did not enter a value in the survey for age of acquisition of Spanish.</w:t>
       </w:r>
     </w:p>
     <w:p>
@@ -1630,35 +1624,35 @@
         <w:pStyle w:val="BodyText"/>
       </w:pPr>
       <w:r>
-        <w:t xml:space="preserve">The participants self-ratings in spoken and perceptual proficiency ranged on a scale from 1 to 10, in which 10 was the most proficient and 1 was the least proficient.</w:t>
-      </w:r>
-      <w:r>
-        <w:t xml:space="preserve"> </w:t>
-      </w:r>
-      <w:r>
-        <w:t xml:space="preserve">The average self-rated German proficiency was, as expected, near ceiling in both spoken (mean rating = 9.84; sd = 0.37) and perceptual proficiency (mean rating = 9.84; sd = 0.37).</w:t>
-      </w:r>
-      <w:r>
-        <w:t xml:space="preserve"> </w:t>
-      </w:r>
-      <w:r>
-        <w:t xml:space="preserve">English self-rated proficiency was second best, and the participants rated themselves slightly higher in perceptual proficiency (mean rating = 8.32; sd = 0.63) than spoken proficiency (mean rating = 8.04; sd = 0.84).</w:t>
-      </w:r>
-      <w:r>
-        <w:t xml:space="preserve"> </w:t>
-      </w:r>
-      <w:r>
-        <w:t xml:space="preserve">The self-rated proficiency levels in Spanish was the lowest and showed the most variation.</w:t>
-      </w:r>
-      <w:r>
-        <w:t xml:space="preserve"> </w:t>
-      </w:r>
-      <w:r>
-        <w:t xml:space="preserve">Specifically, the mean rating for spoken proficiency was 3.6 (sd = 1.83), while perceptual proficiency was 4 (sd = 1.98).</w:t>
+        <w:t xml:space="preserve">Participants rated their productive and receptive proficiency on a scale from 1 to 10, in which 10 was the most proficient and 1 was the least proficient.</w:t>
+      </w:r>
+      <w:r>
+        <w:t xml:space="preserve"> </w:t>
+      </w:r>
+      <w:r>
+        <w:t xml:space="preserve">The average self-rated German proficiency was, as expected, near ceiling in both productive (mean rating = 9.84; sd = 0.37) and receptive proficiency (mean rating = 9.84; sd = 0.37).</w:t>
+      </w:r>
+      <w:r>
+        <w:t xml:space="preserve"> </w:t>
+      </w:r>
+      <w:r>
+        <w:t xml:space="preserve">Self-rated English proficiency was the second highest, and the participants rated themselves slightly higher in receptive proficiency (mean rating = 8.32; sd = 0.63) than productive proficiency (mean rating = 8.04; sd = 0.84).</w:t>
+      </w:r>
+      <w:r>
+        <w:t xml:space="preserve"> </w:t>
+      </w:r>
+      <w:r>
+        <w:t xml:space="preserve">The self-rated proficiency levels in Spanish were the lowest and showed the most variation.</w:t>
+      </w:r>
+      <w:r>
+        <w:t xml:space="preserve"> </w:t>
+      </w:r>
+      <w:r>
+        <w:t xml:space="preserve">Specifically, the mean rating for productive proficiency was 3.6 (sd = 1.83), while receptive proficiency was 4 (sd = 1.98).</w:t>
       </w:r>
     </w:p>
-    <w:bookmarkEnd w:id="26"/>
-    <w:bookmarkStart w:id="30" w:name="materials-and-procedure"/>
+    <w:bookmarkEnd w:id="67"/>
+    <w:bookmarkStart w:id="71" w:name="materials-and-procedure"/>
     <w:p>
       <w:pPr>
         <w:pStyle w:val="Heading2"/>
@@ -1667,7 +1661,7 @@
         <w:t xml:space="preserve">Materials and Procedure</w:t>
       </w:r>
     </w:p>
-    <w:bookmarkStart w:id="28" w:name="lexical-decision-task"/>
+    <w:bookmarkStart w:id="69" w:name="lexical-decision-task"/>
     <w:p>
       <w:pPr>
         <w:pStyle w:val="Heading3"/>
@@ -1717,7 +1711,7 @@
         <w:t xml:space="preserve"> </w:t>
       </w:r>
       <w:r>
-        <w:t xml:space="preserve">on the sides of the screen, then 500ms later, a letter string was displayed in the center of the screen.</w:t>
+        <w:t xml:space="preserve">on the sides of the screen, then 500 ms later, a letter string was displayed in the center of the screen.</w:t>
       </w:r>
       <w:r>
         <w:t xml:space="preserve"> </w:t>
@@ -1753,13 +1747,13 @@
         <w:t xml:space="preserve"> </w:t>
       </w:r>
       <w:r>
-        <w:t xml:space="preserve">Instructions were presented in Spanish, and participants completed a familiarization section with 5 practice trials.</w:t>
-      </w:r>
-      <w:r>
-        <w:t xml:space="preserve"> </w:t>
-      </w:r>
-      <w:r>
-        <w:t xml:space="preserve">The LDT measured accuracy and response times.</w:t>
+        <w:t xml:space="preserve">Instructions were presented in Spanish, and participants completed a practice section with 5 trials.</w:t>
+      </w:r>
+      <w:r>
+        <w:t xml:space="preserve"> </w:t>
+      </w:r>
+      <w:r>
+        <w:t xml:space="preserve">The LDT measured accuracy and response time.</w:t>
       </w:r>
       <w:r>
         <w:t xml:space="preserve"> </w:t>
@@ -1785,7 +1779,7 @@
         <w:pStyle w:val="BodyText"/>
       </w:pPr>
       <w:r>
-        <w:t xml:space="preserve">The stimuli of the LDT included a total of 192 items, of which 96 were Spanish pseudowords, 48 were Spanish noncognates, 24 were double cognates (English-Spanish), and 24 were triple cognates (German-English-Spanish).</w:t>
+        <w:t xml:space="preserve">The LDT included a total of 192 stimuli: 96 Spanish pseudowords, 48 Spanish noncognates, 24 double cognates (English-Spanish), and 24 triple cognates (German-English-Spanish).</w:t>
       </w:r>
       <w:r>
         <w:t xml:space="preserve"> </w:t>
@@ -1797,7 +1791,7 @@
         <w:t xml:space="preserve"> </w:t>
       </w:r>
       <w:r>
-        <w:t xml:space="preserve">All items had between 4 and 6 letters.</w:t>
+        <w:t xml:space="preserve">All items contained between 4 and 6 letters.</w:t>
       </w:r>
       <w:r>
         <w:t xml:space="preserve"> </w:t>
@@ -1864,8 +1858,8 @@
       <w:pPr>
         <w:pStyle w:val="TableCaption"/>
       </w:pPr>
-      <w:bookmarkStart w:id="27" w:name="tab:stim-properties"/>
-      <w:bookmarkEnd w:id="27"/>
+      <w:bookmarkStart w:id="68" w:name="tab:stim-properties"/>
+      <w:bookmarkEnd w:id="68"/>
       <w:r>
         <w:t xml:space="preserve">Table 1:</w:t>
       </w:r>
@@ -4030,8 +4024,8 @@
         </w:tc>
       </w:tr>
     </w:tbl>
-    <w:bookmarkEnd w:id="28"/>
-    <w:bookmarkStart w:id="29" w:name="proficiency-measure-adapted-lextale"/>
+    <w:bookmarkEnd w:id="69"/>
+    <w:bookmarkStart w:id="70" w:name="proficiency-measure-adapted-lextale"/>
     <w:p>
       <w:pPr>
         <w:pStyle w:val="Heading3"/>
@@ -4051,7 +4045,7 @@
         <w:t xml:space="preserve"> </w:t>
       </w:r>
       <w:r>
-        <w:t xml:space="preserve">Specifically, we considered the psuedoword and non-cognates trials as an adapted version of the LexTALE</w:t>
+        <w:t xml:space="preserve">Specifically, we considered the pseudoword and non-cognate trials as an adapted version of the LexTALE</w:t>
       </w:r>
       <w:r>
         <w:t xml:space="preserve"> </w:t>
@@ -4084,19 +4078,19 @@
         <w:t xml:space="preserve"> </w:t>
       </w:r>
       <w:r>
-        <w:t xml:space="preserve">Scores were calculated using a similar scoring system to the original LexTALE to avoid a yes/no bias and to account for the unequal proportion of real words and pseudowords in the included data.</w:t>
-      </w:r>
-      <w:r>
-        <w:t xml:space="preserve"> </w:t>
-      </w:r>
-      <w:r>
-        <w:t xml:space="preserve">Specifically, following formula was used: (number of real words correct/48 x 100 + number of pseudowords correct/98 x 100)/2.</w:t>
-      </w:r>
-      <w:r>
-        <w:t xml:space="preserve"> </w:t>
-      </w:r>
-      <w:r>
-        <w:t xml:space="preserve">The results returned a score from 0 to 100, in which a score of 50 would represent saying either</w:t>
+        <w:t xml:space="preserve">Scores were calculated using a similar scoring system to that of the original LexTALE to avoid a yes/no bias and to account for the unequal proportion of real words and pseudowords in the included data.</w:t>
+      </w:r>
+      <w:r>
+        <w:t xml:space="preserve"> </w:t>
+      </w:r>
+      <w:r>
+        <w:t xml:space="preserve">Specifically, the following formula was used: (number of real words correct/48 x 100 + number of pseudowords correct/98 x 100)/2.</w:t>
+      </w:r>
+      <w:r>
+        <w:t xml:space="preserve"> </w:t>
+      </w:r>
+      <w:r>
+        <w:t xml:space="preserve">The results yielded a score from 0 to 100, in which a score of 50 would represent saying either</w:t>
       </w:r>
       <w:r>
         <w:t xml:space="preserve"> </w:t>
@@ -4147,9 +4141,9 @@
         <w:t xml:space="preserve">The scores ranged from 55.2 to 97.9 with a mean of 73 (sd = 10).</w:t>
       </w:r>
     </w:p>
-    <w:bookmarkEnd w:id="29"/>
-    <w:bookmarkEnd w:id="30"/>
-    <w:bookmarkStart w:id="33" w:name="data-analysis"/>
+    <w:bookmarkEnd w:id="70"/>
+    <w:bookmarkEnd w:id="71"/>
+    <w:bookmarkStart w:id="74" w:name="data-analysis"/>
     <w:p>
       <w:pPr>
         <w:pStyle w:val="Heading2"/>
@@ -4158,7 +4152,7 @@
         <w:t xml:space="preserve">Data Analysis</w:t>
       </w:r>
     </w:p>
-    <w:bookmarkStart w:id="31" w:name="analysis-justification"/>
+    <w:bookmarkStart w:id="72" w:name="analysis-justification"/>
     <w:p>
       <w:pPr>
         <w:pStyle w:val="Heading3"/>
@@ -4178,7 +4172,7 @@
         <w:t xml:space="preserve"> </w:t>
       </w:r>
       <w:r>
-        <w:t xml:space="preserve">First, Bayesian models allow for a more gradient analysis than the often used frequentist p-value, in which is is more typical to take a binary, all-or-nothing approach (e.g. there either is or is not evidence for a difference between conditions).</w:t>
+        <w:t xml:space="preserve">First, Bayesian models allow for a more gradient analysis than the often used frequentist p-value, in which it is more typical to take a binary, all-or-nothing approach (e.g. there either is or is not evidence for a difference between conditions).</w:t>
       </w:r>
       <w:r>
         <w:t xml:space="preserve"> </w:t>
@@ -4190,7 +4184,7 @@
         <w:t xml:space="preserve"> </w:t>
       </w:r>
       <w:r>
-        <w:t xml:space="preserve">Taken together, the Bayesian Framework offers both flexibility and for more gradient interpretations of both the null and alternative hypotheses.</w:t>
+        <w:t xml:space="preserve">Taken together, the Bayesian Framework offers greater flexibility and allows for more gradient interpretations of both the null and alternative hypotheses.</w:t>
       </w:r>
     </w:p>
     <w:p>
@@ -4216,7 +4210,7 @@
         <w:t xml:space="preserve"> </w:t>
       </w:r>
       <w:r>
-        <w:t xml:space="preserve">It is mathematically defined as the proportion of the posterior distribution that is the same sign its median estimate</w:t>
+        <w:t xml:space="preserve">It is mathematically defined as the proportion of the posterior distribution that is the same sign as its median estimate</w:t>
       </w:r>
       <w:r>
         <w:t xml:space="preserve"> </w:t>
@@ -4263,14 +4257,14 @@
         <w:t xml:space="preserve">Consequently, evidence can be interpreted as varying continuously in strength rather than being reduced to a dichotomous significant/non-significant outcome.</w:t>
       </w:r>
     </w:p>
-    <w:bookmarkEnd w:id="31"/>
-    <w:bookmarkStart w:id="32" w:name="model-speficications"/>
+    <w:bookmarkEnd w:id="72"/>
+    <w:bookmarkStart w:id="73" w:name="model-speficications"/>
     <w:p>
       <w:pPr>
         <w:pStyle w:val="Heading3"/>
       </w:pPr>
       <w:r>
-        <w:t xml:space="preserve">Model speficications</w:t>
+        <w:t xml:space="preserve">Model Speficications</w:t>
       </w:r>
     </w:p>
     <w:p>
@@ -4278,13 +4272,13 @@
         <w:pStyle w:val="FirstParagraph"/>
       </w:pPr>
       <w:r>
-        <w:t xml:space="preserve">The data were analyzed using two Bayesian multilevel regression models for accuracy and reaction time.</w:t>
-      </w:r>
-      <w:r>
-        <w:t xml:space="preserve"> </w:t>
-      </w:r>
-      <w:r>
-        <w:t xml:space="preserve">Both models were fit to the data using the brms</w:t>
+        <w:t xml:space="preserve">The data were analyzed using two Bayesian multilevel regression models for accuracy and response time.</w:t>
+      </w:r>
+      <w:r>
+        <w:t xml:space="preserve"> </w:t>
+      </w:r>
+      <w:r>
+        <w:t xml:space="preserve">Both models were fit using the brms package in R</w:t>
       </w:r>
       <w:r>
         <w:t xml:space="preserve"> </w:t>
@@ -4296,7 +4290,7 @@
         <w:t xml:space="preserve"> </w:t>
       </w:r>
       <w:r>
-        <w:t xml:space="preserve">package in R and were estimated with Markov chain Monte Carlo sampling using 4 chains, each with 4000 iterations, including 2000 warm-up.</w:t>
+        <w:t xml:space="preserve">and estimated with Markov chain Monte Carlo sampling using 4 chains, each with 4000 iterations, including 2000 warm-up iterations.</w:t>
       </w:r>
       <w:r>
         <w:t xml:space="preserve"> </w:t>
@@ -4320,7 +4314,7 @@
         <w:t xml:space="preserve"> </w:t>
       </w:r>
       <w:r>
-        <w:t xml:space="preserve">The random effects structure include a random slope for each participant and a random intercept for word (stimulus).</w:t>
+        <w:t xml:space="preserve">The random-effects structure included a random slope for each participant and a random intercept for word (stimulus).</w:t>
       </w:r>
       <w:r>
         <w:t xml:space="preserve"> </w:t>
@@ -4341,19 +4335,19 @@
         <w:t xml:space="preserve"> </w:t>
       </w:r>
       <w:r>
-        <w:t xml:space="preserve">The reaction time model predicted the log reaction time of correct responses as a function of the same predictors and random effect structure.</w:t>
-      </w:r>
-      <w:r>
-        <w:t xml:space="preserve"> </w:t>
-      </w:r>
-      <w:r>
-        <w:t xml:space="preserve">In this case, the ROPE was set to +/-0.0065 log reaction time, or +/- approximately 5ms.</w:t>
+        <w:t xml:space="preserve">The response-time model predicted the log response time of correct responses as a function of the same predictors and random effect structure.</w:t>
+      </w:r>
+      <w:r>
+        <w:t xml:space="preserve"> </w:t>
+      </w:r>
+      <w:r>
+        <w:t xml:space="preserve">In this case, the ROPE was set to +/-0.0065 log reaction time, or +/- approximately 5 ms.</w:t>
       </w:r>
     </w:p>
-    <w:bookmarkEnd w:id="32"/>
-    <w:bookmarkEnd w:id="33"/>
-    <w:bookmarkEnd w:id="34"/>
-    <w:bookmarkStart w:id="60" w:name="results"/>
+    <w:bookmarkEnd w:id="73"/>
+    <w:bookmarkEnd w:id="74"/>
+    <w:bookmarkEnd w:id="75"/>
+    <w:bookmarkStart w:id="101" w:name="results"/>
     <w:p>
       <w:pPr>
         <w:pStyle w:val="Heading1"/>
@@ -4362,7 +4356,7 @@
         <w:t xml:space="preserve">Results</w:t>
       </w:r>
     </w:p>
-    <w:bookmarkStart w:id="35" w:name="data-trimming"/>
+    <w:bookmarkStart w:id="76" w:name="data-trimming"/>
     <w:p>
       <w:pPr>
         <w:pStyle w:val="Heading2"/>
@@ -4376,7 +4370,7 @@
         <w:pStyle w:val="FirstParagraph"/>
       </w:pPr>
       <w:r>
-        <w:t xml:space="preserve">The data set for accuracy included 35 participants contained a total of 6720 data points (192 trials x 35 participants) and maintained all correct and incorrect trials.</w:t>
+        <w:t xml:space="preserve">The data set for accuracy included 35 participants, contained a total of 6720 data points (192 trials x 35 participants), and maintained all correct and incorrect trials.</w:t>
       </w:r>
       <w:r>
         <w:t xml:space="preserve"> </w:t>
@@ -4388,11 +4382,23 @@
         <w:t xml:space="preserve"> </w:t>
       </w:r>
       <w:r>
-        <w:t xml:space="preserve">For reaction time the analyzed data frame contained 2180 data points after removing pseudoword trials (n = 3360), incorrect trials (n = 1473), trials that were too fast (n = 195) or too slow (n = 417). Some trials fit multiple criteria for removal, and a trial was considered too fast or too slow when the reaction time was under 500ms or over 2 seconds.</w:t>
+        <w:t xml:space="preserve">For response time, the analyzed data frame contained 2180 data points after removing pseudoword trials (n = 3360), incorrect trials (n = 1473), trials that were too fast (n = 195) or too slow (n = 417).</w:t>
+      </w:r>
+      <w:r>
+        <w:t xml:space="preserve"> </w:t>
+      </w:r>
+      <w:r>
+        <w:t xml:space="preserve">Some trials fit multiple criteria for removal.</w:t>
+      </w:r>
+      <w:r>
+        <w:t xml:space="preserve"> </w:t>
+      </w:r>
+      <w:r>
+        <w:t xml:space="preserve">A trial was considered too fast or too slow when the response time was below 500 ms or above 2 seconds.</w:t>
       </w:r>
     </w:p>
-    <w:bookmarkEnd w:id="35"/>
-    <w:bookmarkStart w:id="49" w:name="accuracy"/>
+    <w:bookmarkEnd w:id="76"/>
+    <w:bookmarkStart w:id="90" w:name="accuracy"/>
     <w:p>
       <w:pPr>
         <w:pStyle w:val="Heading2"/>
@@ -4408,20 +4414,20 @@
       <w:r>
         <w:drawing>
           <wp:inline>
-            <wp:extent cx="4579632" cy="3663706"/>
+            <wp:extent cx="4579632" cy="3662179"/>
             <wp:effectExtent b="0" l="0" r="0" t="0"/>
-            <wp:docPr descr="Figure 1: Percentage of correct responses by word type" title="" id="37" name="Picture"/>
+            <wp:docPr descr="Figure 1: Percentage of correct responses by word type" title="" id="78" name="Picture"/>
             <a:graphic>
               <a:graphicData uri="http://schemas.openxmlformats.org/drawingml/2006/picture">
                 <pic:pic>
                   <pic:nvPicPr>
-                    <pic:cNvPr descr="main_files/a354b48f7ca136872546c802465ea0ba69be1903.png" id="38" name="Picture"/>
+                    <pic:cNvPr descr="../plots/overall_acc.png" id="79" name="Picture"/>
                     <pic:cNvPicPr>
                       <a:picLocks noChangeArrowheads="1" noChangeAspect="1"/>
                     </pic:cNvPicPr>
                   </pic:nvPicPr>
                   <pic:blipFill>
-                    <a:blip r:embed="rId36"/>
+                    <a:blip r:embed="rId77"/>
                     <a:stretch>
                       <a:fillRect/>
                     </a:stretch>
@@ -4429,7 +4435,7 @@
                   <pic:spPr bwMode="auto">
                     <a:xfrm>
                       <a:off x="0" y="0"/>
-                      <a:ext cx="4579632" cy="3663706"/>
+                      <a:ext cx="4579632" cy="3662179"/>
                     </a:xfrm>
                     <a:prstGeom prst="rect">
                       <a:avLst/>
@@ -4452,8 +4458,8 @@
       <w:pPr>
         <w:pStyle w:val="ImageCaption"/>
       </w:pPr>
-      <w:bookmarkStart w:id="39" w:name="fig:accuracy"/>
-      <w:bookmarkEnd w:id="39"/>
+      <w:bookmarkStart w:id="80" w:name="fig:accuracy"/>
+      <w:bookmarkEnd w:id="80"/>
       <w:r>
         <w:t xml:space="preserve">Figure 1: Percentage of correct responses by word type</w:t>
       </w:r>
@@ -4487,7 +4493,7 @@
         <w:t xml:space="preserve"> </w:t>
       </w:r>
       <w:r>
-        <w:t xml:space="preserve">Participants were most accurate for triple cognates (88.81%), followed by double cognates (81.69%) and non-cognates were the least accurate (63.57%).</w:t>
+        <w:t xml:space="preserve">Participants were most accurate for triple cognates (88.81%), followed by double cognates (81.69%) and least accurate for non-cognates (63.57%).</w:t>
       </w:r>
     </w:p>
     <w:p>
@@ -4495,7 +4501,7 @@
         <w:pStyle w:val="BodyText"/>
       </w:pPr>
       <w:r>
-        <w:t xml:space="preserve">For most individual participants, cognates were helpful in correctly answered a trial, but there were a few exceptions.</w:t>
+        <w:t xml:space="preserve">Most individual participants were generally more accurate on cognate trials, but there were a few exceptions.</w:t>
       </w:r>
       <w:r>
         <w:t xml:space="preserve"> </w:t>
@@ -4513,19 +4519,19 @@
         <w:t xml:space="preserve"> </w:t>
       </w:r>
       <w:r>
-        <w:t xml:space="preserve">shows histograms of individuals’ percentage of correct trials in each word-type.</w:t>
-      </w:r>
-      <w:r>
-        <w:t xml:space="preserve"> </w:t>
-      </w:r>
-      <w:r>
-        <w:t xml:space="preserve">Individual accuracy in non-cognates ranged from 27.27 % of trials correct to 97.73% (median 63.64%).</w:t>
-      </w:r>
-      <w:r>
-        <w:t xml:space="preserve"> </w:t>
-      </w:r>
-      <w:r>
-        <w:t xml:space="preserve">Like the data set as a whole, the median of individual percentages correct for the triple cognates was the highest: 91.67% (range 58.33% - 100.00%), followed by double cognates (median percentage correct = 81.82%; range = 50.00% - 100.00).</w:t>
+        <w:t xml:space="preserve">shows histograms of individuals’ percentage of correct trials in each word type.</w:t>
+      </w:r>
+      <w:r>
+        <w:t xml:space="preserve"> </w:t>
+      </w:r>
+      <w:r>
+        <w:t xml:space="preserve">Individual accuracy in non-cognates ranged from 27.27 % of correct trials to 97.73% (median 63.64%).</w:t>
+      </w:r>
+      <w:r>
+        <w:t xml:space="preserve"> </w:t>
+      </w:r>
+      <w:r>
+        <w:t xml:space="preserve">As in the data set as a whole, median individual accuracy was the highest for triple cognates: 91.67% (range 58.33% - 100.00%), followed by double cognates (median percentage correct = 81.82%; range = 50.00% - 100.00).</w:t>
       </w:r>
       <w:r>
         <w:t xml:space="preserve"> </w:t>
@@ -4537,7 +4543,7 @@
         <w:t xml:space="preserve"> </w:t>
       </w:r>
       <w:r>
-        <w:t xml:space="preserve">Indeed, two participants showed the opposite of expected and were most accurate in non-cognates (60.4% and 68.7%) and much less accurate in two-way (25% and 16.7%) and triple cognates (20.8% and 8.3%).</w:t>
+        <w:t xml:space="preserve">Indeed, two participants showed the opposite of the expected pattern and were most accurate for non-cognates (60.4% and 68.7%) and much less accurate for double (25% and 16.7%) and triple cognates (20.8% and 8.3%).</w:t>
       </w:r>
     </w:p>
     <w:p>
@@ -4547,20 +4553,20 @@
       <w:r>
         <w:drawing>
           <wp:inline>
-            <wp:extent cx="4579632" cy="3663706"/>
+            <wp:extent cx="4579632" cy="3662179"/>
             <wp:effectExtent b="0" l="0" r="0" t="0"/>
-            <wp:docPr descr="Figure 2: Histograms of individual percentages corrects by word type" title="" id="41" name="Picture"/>
+            <wp:docPr descr="Figure 2: Histograms of individual accuracy percentages by word type" title="" id="82" name="Picture"/>
             <a:graphic>
               <a:graphicData uri="http://schemas.openxmlformats.org/drawingml/2006/picture">
                 <pic:pic>
                   <pic:nvPicPr>
-                    <pic:cNvPr descr="main_files/d9674eaf13c03b4af440db2d7919de643149fee0.png" id="42" name="Picture"/>
+                    <pic:cNvPr descr="../plots/ind_acc.png" id="83" name="Picture"/>
                     <pic:cNvPicPr>
                       <a:picLocks noChangeArrowheads="1" noChangeAspect="1"/>
                     </pic:cNvPicPr>
                   </pic:nvPicPr>
                   <pic:blipFill>
-                    <a:blip r:embed="rId40"/>
+                    <a:blip r:embed="rId81"/>
                     <a:stretch>
                       <a:fillRect/>
                     </a:stretch>
@@ -4568,7 +4574,7 @@
                   <pic:spPr bwMode="auto">
                     <a:xfrm>
                       <a:off x="0" y="0"/>
-                      <a:ext cx="4579632" cy="3663706"/>
+                      <a:ext cx="4579632" cy="3662179"/>
                     </a:xfrm>
                     <a:prstGeom prst="rect">
                       <a:avLst/>
@@ -4591,10 +4597,10 @@
       <w:pPr>
         <w:pStyle w:val="ImageCaption"/>
       </w:pPr>
-      <w:bookmarkStart w:id="43" w:name="fig:accuracyind"/>
-      <w:bookmarkEnd w:id="43"/>
-      <w:r>
-        <w:t xml:space="preserve">Figure 2: Histograms of individual percentages corrects by word type</w:t>
+      <w:bookmarkStart w:id="84" w:name="fig:accuracyind"/>
+      <w:bookmarkEnd w:id="84"/>
+      <w:r>
+        <w:t xml:space="preserve">Figure 2: Histograms of individual accuracy percentages by word type</w:t>
       </w:r>
     </w:p>
     <w:p>
@@ -4602,7 +4608,7 @@
         <w:pStyle w:val="BodyText"/>
       </w:pPr>
       <w:r>
-        <w:t xml:space="preserve">L3 proficiency, as measured by the adapted LexTALE was more beneficial for accuracy at lower levels of proficiency.</w:t>
+        <w:t xml:space="preserve">The relative accuracy advantage for cognates was greater at lower levels of L3 proficiency, as measured by the adapted LexTALE.</w:t>
       </w:r>
       <w:r>
         <w:t xml:space="preserve"> </w:t>
@@ -4620,19 +4626,19 @@
         <w:t xml:space="preserve"> </w:t>
       </w:r>
       <w:r>
-        <w:t xml:space="preserve">shows the change in accuracy for non-cogates relative to both double and triple cognates.</w:t>
-      </w:r>
-      <w:r>
-        <w:t xml:space="preserve"> </w:t>
-      </w:r>
-      <w:r>
-        <w:t xml:space="preserve">A positive value on the plot refers to an advantage for that cognate types of the value on the y-axis.</w:t>
-      </w:r>
-      <w:r>
-        <w:t xml:space="preserve"> </w:t>
-      </w:r>
-      <w:r>
-        <w:t xml:space="preserve">For example, a value of 40 on the y-axis means that a specific participant was 40% more accurate in a cognate condition than non-cognates.</w:t>
+        <w:t xml:space="preserve">shows the change in accuracy for non-cognates relative to both double and triple cognates.</w:t>
+      </w:r>
+      <w:r>
+        <w:t xml:space="preserve"> </w:t>
+      </w:r>
+      <w:r>
+        <w:t xml:space="preserve">A positive value indicates an accuracy advantage for the corresponding cognate type relative to non-cognates, with the magnitude of the advantage represented on the y-axis.</w:t>
+      </w:r>
+      <w:r>
+        <w:t xml:space="preserve"> </w:t>
+      </w:r>
+      <w:r>
+        <w:t xml:space="preserve">For example, a value of 40 on the y-axis means that a specific participant was 40% more accurate on a cognate condition than non-cognates.</w:t>
       </w:r>
       <w:r>
         <w:t xml:space="preserve"> </w:t>
@@ -4644,7 +4650,7 @@
         <w:t xml:space="preserve"> </w:t>
       </w:r>
       <w:r>
-        <w:t xml:space="preserve">The fitted lines represent the predicted increase in accuracy as proficiency increases.</w:t>
+        <w:t xml:space="preserve">The fitted lines represent the predicted change in the cognate advantage as proficiency increases.</w:t>
       </w:r>
       <w:r>
         <w:t xml:space="preserve"> </w:t>
@@ -4660,20 +4666,20 @@
       <w:r>
         <w:drawing>
           <wp:inline>
-            <wp:extent cx="4579632" cy="3663706"/>
+            <wp:extent cx="4579632" cy="3662179"/>
             <wp:effectExtent b="0" l="0" r="0" t="0"/>
-            <wp:docPr descr="Figure 3: Increase in accuracy as a function of proficiency and word type" title="" id="45" name="Picture"/>
+            <wp:docPr descr="Figure 3: Increase in accuracy as a function of proficiency and word type" title="" id="86" name="Picture"/>
             <a:graphic>
               <a:graphicData uri="http://schemas.openxmlformats.org/drawingml/2006/picture">
                 <pic:pic>
                   <pic:nvPicPr>
-                    <pic:cNvPr descr="main_files/a0acd71f9cde22dfb5da8847a8379a0a1a0b14d5.png" id="46" name="Picture"/>
+                    <pic:cNvPr descr="../plots/ind_acc_prof.png" id="87" name="Picture"/>
                     <pic:cNvPicPr>
                       <a:picLocks noChangeArrowheads="1" noChangeAspect="1"/>
                     </pic:cNvPicPr>
                   </pic:nvPicPr>
                   <pic:blipFill>
-                    <a:blip r:embed="rId44"/>
+                    <a:blip r:embed="rId85"/>
                     <a:stretch>
                       <a:fillRect/>
                     </a:stretch>
@@ -4681,7 +4687,7 @@
                   <pic:spPr bwMode="auto">
                     <a:xfrm>
                       <a:off x="0" y="0"/>
-                      <a:ext cx="4579632" cy="3663706"/>
+                      <a:ext cx="4579632" cy="3662179"/>
                     </a:xfrm>
                     <a:prstGeom prst="rect">
                       <a:avLst/>
@@ -4704,8 +4710,8 @@
       <w:pPr>
         <w:pStyle w:val="ImageCaption"/>
       </w:pPr>
-      <w:bookmarkStart w:id="47" w:name="fig:accuracyindpro"/>
-      <w:bookmarkEnd w:id="47"/>
+      <w:bookmarkStart w:id="88" w:name="fig:accuracyindpro"/>
+      <w:bookmarkEnd w:id="88"/>
       <w:r>
         <w:t xml:space="preserve">Figure 3: Increase in accuracy as a function of proficiency and word type</w:t>
       </w:r>
@@ -4714,8 +4720,8 @@
       <w:pPr>
         <w:pStyle w:val="TableCaption"/>
       </w:pPr>
-      <w:bookmarkStart w:id="48" w:name="tab:unnamed-chunk-16"/>
-      <w:bookmarkEnd w:id="48"/>
+      <w:bookmarkStart w:id="89" w:name="tab:unnamed-chunk-16"/>
+      <w:bookmarkEnd w:id="89"/>
       <w:r>
         <w:t xml:space="preserve">Table 2:</w:t>
       </w:r>
@@ -7371,7 +7377,7 @@
         <w:pStyle w:val="BodyText"/>
       </w:pPr>
       <w:r>
-        <w:t xml:space="preserve">The Bayesian Model largely corroborated the descriptive effects.</w:t>
+        <w:t xml:space="preserve">The Bayesian model largely corroborated the descriptive effects.</w:t>
       </w:r>
       <w:r>
         <w:t xml:space="preserve"> </w:t>
@@ -7407,7 +7413,7 @@
         <w:t xml:space="preserve"> </w:t>
       </w:r>
       <w:r>
-        <w:t xml:space="preserve">In practice, this corresponds to a participant with average proficiency would be accurate 91.2% of the time for words of average lexical frequency.</w:t>
+        <w:t xml:space="preserve">In practice, this corresponds to an estimated accuracy of 91.2% for a participant with average proficiency responding to a word of average lexical frequency.</w:t>
       </w:r>
       <w:r>
         <w:t xml:space="preserve"> </w:t>
@@ -7431,7 +7437,7 @@
         <w:t xml:space="preserve"> </w:t>
       </w:r>
       <w:r>
-        <w:t xml:space="preserve">For triple cognates, the median effect was 0.71 95% HDI = [0, 1.39], indicating that the most credible values of the effect were positive.</w:t>
+        <w:t xml:space="preserve">For triple cognates, the median effect was 0.71, 95% HDI = [0, 1.39], indicating that the most credible values of the effect were positive.</w:t>
       </w:r>
       <w:r>
         <w:t xml:space="preserve"> </w:t>
@@ -7457,13 +7463,13 @@
         <w:pStyle w:val="BodyText"/>
       </w:pPr>
       <w:r>
-        <w:t xml:space="preserve">Higher numbers for both the continuous predictors lexical frequency and proficiency were associated with higher accuracy.</w:t>
-      </w:r>
-      <w:r>
-        <w:t xml:space="preserve"> </w:t>
-      </w:r>
-      <w:r>
-        <w:t xml:space="preserve">For lexical frequency, the median estimate was 1.01 [0.79, 1.24], indicating that a one standard deviation increase in lexical frequency was associated with an increase of 1.01 in the log-odds of a correct response.</w:t>
+        <w:t xml:space="preserve">Higher values for both continuous predictors, lexical frequency and proficiency, were associated with greater accuracy.</w:t>
+      </w:r>
+      <w:r>
+        <w:t xml:space="preserve"> </w:t>
+      </w:r>
+      <w:r>
+        <w:t xml:space="preserve">For lexical frequency, the median estimate was 1.01, 95% HDI = [0.79, 1.24], indicating that a one standard deviation increase in lexical frequency was associated with an increase of 1.01 in the log-odds of a correct response.</w:t>
       </w:r>
       <w:r>
         <w:t xml:space="preserve"> </w:t>
@@ -7481,29 +7487,29 @@
         <w:t xml:space="preserve"> </w:t>
       </w:r>
       <w:r>
-        <w:t xml:space="preserve">Proficiency was also shown the be positively associated with accuracy; the estimate 0.78 [0.43, 1.15] suggests that a one standard deviation increase in the adapted LexTALE score was associated with an increase of 0.78 increase in the log-odds of a correct response.</w:t>
-      </w:r>
-      <w:r>
-        <w:t xml:space="preserve"> </w:t>
-      </w:r>
-      <w:r>
-        <w:t xml:space="preserve">Predicted accuracy increases to around 96.6% by participants that were 1 standard deviation more proficient than average, while it dropped to 82.6% for participants that were one standard deviation less proficient than average.</w:t>
-      </w:r>
-      <w:r>
-        <w:t xml:space="preserve"> </w:t>
-      </w:r>
-      <w:r>
-        <w:t xml:space="preserve">Like frequency, the pd (1) and ROPE percentage (0) provide compelling evidence of that the effect is positive and not negligible.</w:t>
+        <w:t xml:space="preserve">Proficiency was also shown to be positively associated with accuracy; the estimate 0.78, 95% HDI = [0.43, 1.15] suggests that a one standard deviation increase in the adapted LexTALE score was associated with an increase of 0.78 in the log-odds of a correct response.</w:t>
+      </w:r>
+      <w:r>
+        <w:t xml:space="preserve"> </w:t>
+      </w:r>
+      <w:r>
+        <w:t xml:space="preserve">Predicted accuracy increases to around 96.6% by participants who were 1 standard deviation more proficient than average, while it dropped to 82.6% for participants that were one standard deviation less proficient than average.</w:t>
+      </w:r>
+      <w:r>
+        <w:t xml:space="preserve"> </w:t>
+      </w:r>
+      <w:r>
+        <w:t xml:space="preserve">Like frequency, the pd (1) and ROPE percentage (0) provide compelling evidence that the effect is positive and not negligible.</w:t>
       </w:r>
     </w:p>
-    <w:bookmarkEnd w:id="49"/>
-    <w:bookmarkStart w:id="59" w:name="reaction-time"/>
+    <w:bookmarkEnd w:id="90"/>
+    <w:bookmarkStart w:id="100" w:name="response-time"/>
     <w:p>
       <w:pPr>
         <w:pStyle w:val="Heading2"/>
       </w:pPr>
       <w:r>
-        <w:t xml:space="preserve">Reaction time</w:t>
+        <w:t xml:space="preserve">Response time</w:t>
       </w:r>
     </w:p>
     <w:p>
@@ -7511,7 +7517,7 @@
         <w:pStyle w:val="FirstParagraph"/>
       </w:pPr>
       <w:r>
-        <w:t xml:space="preserve">Like accuracy, the analysis of the reaction time data showed evidence of a general cognate facilitation effect.</w:t>
+        <w:t xml:space="preserve">Like accuracy, the analysis of the response time data showed evidence of a general cognate facilitation effect.</w:t>
       </w:r>
       <w:r>
         <w:t xml:space="preserve"> </w:t>
@@ -7529,19 +7535,19 @@
         <w:t xml:space="preserve"> </w:t>
       </w:r>
       <w:r>
-        <w:t xml:space="preserve">shows the overall mean reaction times in milliseconds in for each word type.</w:t>
-      </w:r>
-      <w:r>
-        <w:t xml:space="preserve"> </w:t>
-      </w:r>
-      <w:r>
-        <w:t xml:space="preserve">Non-cognate words were recognized as real words slowest (mean reaction time 881.67ms, sd = 304.77), while both two-way (827.33ms, sd = 296.70) and triple cognates were recognized faster 817.38ms, sd = 263.04.</w:t>
-      </w:r>
-      <w:r>
-        <w:t xml:space="preserve"> </w:t>
-      </w:r>
-      <w:r>
-        <w:t xml:space="preserve">The difference in reaction time between two-way and triple cognates was quite small (d = .03).</w:t>
+        <w:t xml:space="preserve">shows the overall mean response times in milliseconds for each word type.</w:t>
+      </w:r>
+      <w:r>
+        <w:t xml:space="preserve"> </w:t>
+      </w:r>
+      <w:r>
+        <w:t xml:space="preserve">Non-cognate words were recognized as real words the slowest (mean response time 881.67ms, sd = 304.77), while both double (827.33ms, sd = 296.70) and triple cognates were recognized faster 817.38ms, sd = 263.04.</w:t>
+      </w:r>
+      <w:r>
+        <w:t xml:space="preserve"> </w:t>
+      </w:r>
+      <w:r>
+        <w:t xml:space="preserve">The difference in response time between double and triple cognates was quite small (d = .03).</w:t>
       </w:r>
     </w:p>
     <w:p>
@@ -7549,7 +7555,7 @@
         <w:pStyle w:val="BodyText"/>
       </w:pPr>
       <w:r>
-        <w:t xml:space="preserve">In the case of reaction time, there were even more pronounced differences regarding individual differences.</w:t>
+        <w:t xml:space="preserve">In the case of response time, individual differences were even more pronounced.</w:t>
       </w:r>
       <w:r>
         <w:t xml:space="preserve"> </w:t>
@@ -7573,13 +7579,13 @@
         <w:t xml:space="preserve"> </w:t>
       </w:r>
       <w:r>
-        <w:t xml:space="preserve">It was predicted that if there was a cumulative effect of cognate facilitation, that double to triple cognates would yield negative effects.</w:t>
-      </w:r>
-      <w:r>
-        <w:t xml:space="preserve"> </w:t>
-      </w:r>
-      <w:r>
-        <w:t xml:space="preserve">However, many participants were faster (14 of 35) in double cognates than triple cognates, while the remaining 21 participants showed the opposite pattern and processed triple cognates fastest.</w:t>
+        <w:t xml:space="preserve">It was predicted that if there was a cumulative effect of cognate facilitation, the double-to-triple contrast would yield negative values.</w:t>
+      </w:r>
+      <w:r>
+        <w:t xml:space="preserve"> </w:t>
+      </w:r>
+      <w:r>
+        <w:t xml:space="preserve">However, many participants were faster (14 of 35) for double cognates than triple cognates, while the remaining 21 participants showed the opposite pattern and processed triple cognates fastest.</w:t>
       </w:r>
       <w:r>
         <w:br/>
@@ -7603,7 +7609,7 @@
         <w:t xml:space="preserve"> </w:t>
       </w:r>
       <w:r>
-        <w:t xml:space="preserve">Taken together, these results suggest that while most individuals showed descriptive evidence general cognate effects in reaction time, there was not strong evidence for a cumulative effect in which triple cognates were processed faster than double cognates.</w:t>
+        <w:t xml:space="preserve">Taken together, these results suggest that while most individuals showed descriptive evidence of general cognate effects in response time, there was no strong evidence for a cumulative effect in which triple cognates were processed faster than double cognates.</w:t>
       </w:r>
     </w:p>
     <w:p>
@@ -7611,7 +7617,7 @@
         <w:pStyle w:val="BodyText"/>
       </w:pPr>
       <w:r>
-        <w:t xml:space="preserve">Unlike accuracy, there was no descriptive evidence regarding a relationship between differences in reaction time and L3 proficiency.</w:t>
+        <w:t xml:space="preserve">Unlike accuracy, there was no descriptive evidence regarding a relationship between differences in response time and L3 proficiency.</w:t>
       </w:r>
       <w:r>
         <w:t xml:space="preserve"> </w:t>
@@ -7629,19 +7635,19 @@
         <w:t xml:space="preserve"> </w:t>
       </w:r>
       <w:r>
-        <w:t xml:space="preserve">shows the individual effect sizes for non-cognates to double cognates, non-cognates to triple cognates, and cumulative (double cognate to triple cognates).</w:t>
-      </w:r>
-      <w:r>
-        <w:t xml:space="preserve"> </w:t>
-      </w:r>
-      <w:r>
-        <w:t xml:space="preserve">A negative value in this case indicates that a specific participant was faster in the latter conditon (e.g. a negative value for non-cognates to double cognates would show that the participant reacted faster on average to double cognates).</w:t>
-      </w:r>
-      <w:r>
-        <w:t xml:space="preserve"> </w:t>
-      </w:r>
-      <w:r>
-        <w:t xml:space="preserve">The relatively flat slopes on the fitted lines in each case suggests that the mangnitude of effects does not vary by proficiency level.</w:t>
+        <w:t xml:space="preserve">shows the individual effect sizes for non-cognates to double cognates, non-cognates to triple cognates, and the cumulative contrast (double cognate to triple cognates).</w:t>
+      </w:r>
+      <w:r>
+        <w:t xml:space="preserve"> </w:t>
+      </w:r>
+      <w:r>
+        <w:t xml:space="preserve">A negative value in this case indicates that a specific participant was faster in the latter condition (e.g. a negative value for non-cognates to double cognates would show that the participant reacted faster on average to double cognates).</w:t>
+      </w:r>
+      <w:r>
+        <w:t xml:space="preserve"> </w:t>
+      </w:r>
+      <w:r>
+        <w:t xml:space="preserve">The relatively flat slopes on the fitted lines in each case suggest that the magnitude of effects does not vary by proficiency level.</w:t>
       </w:r>
     </w:p>
     <w:p>
@@ -7651,20 +7657,20 @@
       <w:r>
         <w:drawing>
           <wp:inline>
-            <wp:extent cx="4579632" cy="3663706"/>
+            <wp:extent cx="4579632" cy="3662179"/>
             <wp:effectExtent b="0" l="0" r="0" t="0"/>
-            <wp:docPr descr="Figure 4: Mean reaction time of each word type" title="" id="51" name="Picture"/>
+            <wp:docPr descr="Figure 4: Mean response time of each word type" title="" id="92" name="Picture"/>
             <a:graphic>
               <a:graphicData uri="http://schemas.openxmlformats.org/drawingml/2006/picture">
                 <pic:pic>
                   <pic:nvPicPr>
-                    <pic:cNvPr descr="main_files/75cd5a3b998aaffe6c07506be692e9ce5118dc84.png" id="52" name="Picture"/>
+                    <pic:cNvPr descr="../plots/over_rt.png" id="93" name="Picture"/>
                     <pic:cNvPicPr>
                       <a:picLocks noChangeArrowheads="1" noChangeAspect="1"/>
                     </pic:cNvPicPr>
                   </pic:nvPicPr>
                   <pic:blipFill>
-                    <a:blip r:embed="rId50"/>
+                    <a:blip r:embed="rId91"/>
                     <a:stretch>
                       <a:fillRect/>
                     </a:stretch>
@@ -7672,7 +7678,7 @@
                   <pic:spPr bwMode="auto">
                     <a:xfrm>
                       <a:off x="0" y="0"/>
-                      <a:ext cx="4579632" cy="3663706"/>
+                      <a:ext cx="4579632" cy="3662179"/>
                     </a:xfrm>
                     <a:prstGeom prst="rect">
                       <a:avLst/>
@@ -7695,10 +7701,10 @@
       <w:pPr>
         <w:pStyle w:val="ImageCaption"/>
       </w:pPr>
-      <w:bookmarkStart w:id="53" w:name="fig:overt"/>
-      <w:bookmarkEnd w:id="53"/>
-      <w:r>
-        <w:t xml:space="preserve">Figure 4: Mean reaction time of each word type</w:t>
+      <w:bookmarkStart w:id="94" w:name="fig:overt"/>
+      <w:bookmarkEnd w:id="94"/>
+      <w:r>
+        <w:t xml:space="preserve">Figure 4: Mean response time of each word type</w:t>
       </w:r>
     </w:p>
     <w:p>
@@ -7708,20 +7714,20 @@
       <w:r>
         <w:drawing>
           <wp:inline>
-            <wp:extent cx="4579632" cy="3663706"/>
+            <wp:extent cx="4579632" cy="3662179"/>
             <wp:effectExtent b="0" l="0" r="0" t="0"/>
-            <wp:docPr descr="Figure 5: Individual effects in reaction times" title="" id="55" name="Picture"/>
+            <wp:docPr descr="Figure 5: Individual effects in response times" title="" id="96" name="Picture"/>
             <a:graphic>
               <a:graphicData uri="http://schemas.openxmlformats.org/drawingml/2006/picture">
                 <pic:pic>
                   <pic:nvPicPr>
-                    <pic:cNvPr descr="main_files/34346b50033ae99cea065f06bdc56e5ec35cc7c3.png" id="56" name="Picture"/>
+                    <pic:cNvPr descr="../plots/ind_rt.png" id="97" name="Picture"/>
                     <pic:cNvPicPr>
                       <a:picLocks noChangeArrowheads="1" noChangeAspect="1"/>
                     </pic:cNvPicPr>
                   </pic:nvPicPr>
                   <pic:blipFill>
-                    <a:blip r:embed="rId54"/>
+                    <a:blip r:embed="rId95"/>
                     <a:stretch>
                       <a:fillRect/>
                     </a:stretch>
@@ -7729,7 +7735,7 @@
                   <pic:spPr bwMode="auto">
                     <a:xfrm>
                       <a:off x="0" y="0"/>
-                      <a:ext cx="4579632" cy="3663706"/>
+                      <a:ext cx="4579632" cy="3662179"/>
                     </a:xfrm>
                     <a:prstGeom prst="rect">
                       <a:avLst/>
@@ -7752,18 +7758,18 @@
       <w:pPr>
         <w:pStyle w:val="ImageCaption"/>
       </w:pPr>
-      <w:bookmarkStart w:id="57" w:name="fig:indrt"/>
-      <w:bookmarkEnd w:id="57"/>
-      <w:r>
-        <w:t xml:space="preserve">Figure 5: Individual effects in reaction times</w:t>
+      <w:bookmarkStart w:id="98" w:name="fig:indrt"/>
+      <w:bookmarkEnd w:id="98"/>
+      <w:r>
+        <w:t xml:space="preserve">Figure 5: Individual effects in response times</w:t>
       </w:r>
     </w:p>
     <w:p>
       <w:pPr>
         <w:pStyle w:val="TableCaption"/>
       </w:pPr>
-      <w:bookmarkStart w:id="58" w:name="tab:unnamed-chunk-17"/>
-      <w:bookmarkEnd w:id="58"/>
+      <w:bookmarkStart w:id="99" w:name="tab:unnamed-chunk-17"/>
+      <w:bookmarkEnd w:id="99"/>
       <w:r>
         <w:t xml:space="preserve">Table 3:</w:t>
       </w:r>
@@ -7771,7 +7777,7 @@
         <w:t xml:space="preserve"> </w:t>
       </w:r>
       <w:r>
-        <w:t xml:space="preserve">Posterior Distribution of the Reaction Time Model</w:t>
+        <w:t xml:space="preserve">Posterior Distribution of the Response Time Model</w:t>
       </w:r>
     </w:p>
     <w:tbl xmlns:w="http://schemas.openxmlformats.org/wordprocessingml/2006/main" xmlns:r="http://schemas.openxmlformats.org/officeDocument/2006/relationships" xmlns:w14="http://schemas.microsoft.com/office/word/2010/wordml" xmlns:wp="http://schemas.openxmlformats.org/drawingml/2006/wordprocessingDrawing" xmlns:a="http://schemas.openxmlformats.org/drawingml/2006/main" xmlns:pic="http://schemas.openxmlformats.org/drawingml/2006/picture">
@@ -10419,7 +10425,7 @@
         <w:pStyle w:val="BodyText"/>
       </w:pPr>
       <w:r>
-        <w:t xml:space="preserve">The Bayesian model largely corroborated the descriptive results for reaction time.</w:t>
+        <w:t xml:space="preserve">The Bayesian model largely corroborated the descriptive results for response time.</w:t>
       </w:r>
       <w:r>
         <w:t xml:space="preserve"> </w:t>
@@ -10437,13 +10443,13 @@
         <w:t xml:space="preserve"> </w:t>
       </w:r>
       <w:r>
-        <w:t xml:space="preserve">visualized the posterior distribution of the Bayesian model while Table 3 provides additional details regarding the posterior shape and fit.</w:t>
-      </w:r>
-      <w:r>
-        <w:t xml:space="preserve"> </w:t>
-      </w:r>
-      <w:r>
-        <w:t xml:space="preserve">The intercept term of this model (-0.23) corresponds to the log reaction time of a double cognate of average frequency by a participant with average proficiency.</w:t>
+        <w:t xml:space="preserve">visualizes the posterior distribution of the Bayesian model while Table 3 provides additional details regarding the posterior shape and fit.</w:t>
+      </w:r>
+      <w:r>
+        <w:t xml:space="preserve"> </w:t>
+      </w:r>
+      <w:r>
+        <w:t xml:space="preserve">The intercept term of this model (-0.23) corresponds to the log response time of a double cognate of average frequency by a participant with average proficiency.</w:t>
       </w:r>
       <w:r>
         <w:t xml:space="preserve"> </w:t>
@@ -10455,25 +10461,25 @@
         <w:t xml:space="preserve"> </w:t>
       </w:r>
       <w:r>
-        <w:t xml:space="preserve">The non-cognate model term is 0.08 [0.04, 0.12] and indicates a slow down relative to double cognates of about 288.75 milliseconds.</w:t>
-      </w:r>
-      <w:r>
-        <w:t xml:space="preserve"> </w:t>
-      </w:r>
-      <w:r>
-        <w:t xml:space="preserve">triple cognates were predicted to be processed slightly faster that double cognates (-0.02 [-0.07, 0.02]), but had both positive and negative plausible estimates in the posterior distribution, as well as a relatively low pd (0.83) and % in the ROPE.</w:t>
-      </w:r>
-      <w:r>
-        <w:t xml:space="preserve"> </w:t>
-      </w:r>
-      <w:r>
-        <w:t xml:space="preserve">Lexical frequency was a strong predictor of reaction time.</w:t>
-      </w:r>
-      <w:r>
-        <w:t xml:space="preserve"> </w:t>
-      </w:r>
-      <w:r>
-        <w:t xml:space="preserve">Like with accuracy, the model term represents the change in reaction time for a one standard deviation increase in frequency and in this case predicts faster reactions (-0.07 [-0.08, -0.05]) in more frequent words corresponding to</w:t>
+        <w:t xml:space="preserve">The non-cognate model term is 0.08 [0.04, 0.12] and indicates a slowdown relative to double cognates of about 288.75 milliseconds.</w:t>
+      </w:r>
+      <w:r>
+        <w:t xml:space="preserve"> </w:t>
+      </w:r>
+      <w:r>
+        <w:t xml:space="preserve">Triple cognates were predicted to be processed slightly faster than double cognates (-0.02 [-0.07, 0.02]), but had both positive and negative plausible estimates in the posterior distribution, as well as a relatively low pd (0.83) and % in the ROPE.</w:t>
+      </w:r>
+      <w:r>
+        <w:t xml:space="preserve"> </w:t>
+      </w:r>
+      <w:r>
+        <w:t xml:space="preserve">Lexical frequency was a strong predictor of response time.</w:t>
+      </w:r>
+      <w:r>
+        <w:t xml:space="preserve"> </w:t>
+      </w:r>
+      <w:r>
+        <w:t xml:space="preserve">As with accuracy, the model term represents the change in response time associated with a one standard-deviation increase in frequency, predicting faster responses (-0.07 [-0.08, -0.05]) in more frequent words, corresponding to an estimated difference of</w:t>
       </w:r>
       <w:r>
         <w:t xml:space="preserve"> </w:t>
@@ -10500,7 +10506,7 @@
         <w:t xml:space="preserve"> </w:t>
       </w:r>
       <w:r>
-        <w:t xml:space="preserve">Taken together, the results of the model point to a general cognate effect that is not explained by proficiency and with lexical frequency held constant.</w:t>
+        <w:t xml:space="preserve">Taken together, the results of the model provide evidence for a general cognate effect after accounting for proficiency and lexical frequency.</w:t>
       </w:r>
       <w:r>
         <w:t xml:space="preserve"> </w:t>
@@ -10509,9 +10515,9 @@
         <w:t xml:space="preserve">Importantly, the model does not support a cumulative effect in lexical decisions.</w:t>
       </w:r>
     </w:p>
-    <w:bookmarkEnd w:id="59"/>
-    <w:bookmarkEnd w:id="60"/>
-    <w:bookmarkStart w:id="64" w:name="discussion"/>
+    <w:bookmarkEnd w:id="100"/>
+    <w:bookmarkEnd w:id="101"/>
+    <w:bookmarkStart w:id="105" w:name="discussion"/>
     <w:p>
       <w:pPr>
         <w:pStyle w:val="Heading1"/>
@@ -10558,7 +10564,7 @@
         <w:t xml:space="preserve">Thus, the results reveal an asymmetry between accuracy and speed of lexical processing for a cumulative facilitation effect.</w:t>
       </w:r>
     </w:p>
-    <w:bookmarkStart w:id="61" w:name="cognate-effects-in-l3-lexical-processing"/>
+    <w:bookmarkStart w:id="102" w:name="cognate-effects-in-l3-lexical-processing"/>
     <w:p>
       <w:pPr>
         <w:pStyle w:val="Heading2"/>
@@ -10932,8 +10938,8 @@
         <w:t xml:space="preserve">This measure-dependent pattern may help explain some of the mixed findings in previous trilingual cognate research, where cumulative effects have varied across tasks, participant populations, and dependent measures.</w:t>
       </w:r>
     </w:p>
-    <w:bookmarkEnd w:id="61"/>
-    <w:bookmarkStart w:id="62" w:name="the-role-l3-proficiency"/>
+    <w:bookmarkEnd w:id="102"/>
+    <w:bookmarkStart w:id="103" w:name="the-role-l3-proficiency"/>
     <w:p>
       <w:pPr>
         <w:pStyle w:val="Heading2"/>
@@ -11030,8 +11036,8 @@
         <w:t xml:space="preserve">Notably, whereas the results provided evidence of an overall proficiency effect, with more proficient participants performing more accurately overall, the findings did not support proficiency-related modulation of cognate facilitation.</w:t>
       </w:r>
     </w:p>
-    <w:bookmarkEnd w:id="62"/>
-    <w:bookmarkStart w:id="63" w:name="X34cb8421ee2df0f1a7181de3f744d8d9e3235c6"/>
+    <w:bookmarkEnd w:id="103"/>
+    <w:bookmarkStart w:id="104" w:name="X34cb8421ee2df0f1a7181de3f744d8d9e3235c6"/>
     <w:p>
       <w:pPr>
         <w:pStyle w:val="Heading2"/>
@@ -11151,9 +11157,9 @@
         <w:t xml:space="preserve">Studies reporting only latency or only accuracy may reach different conclusions about whether triple cognates receive an additional processing benefit.</w:t>
       </w:r>
     </w:p>
-    <w:bookmarkEnd w:id="63"/>
-    <w:bookmarkEnd w:id="64"/>
-    <w:bookmarkStart w:id="65" w:name="conclusion"/>
+    <w:bookmarkEnd w:id="104"/>
+    <w:bookmarkEnd w:id="105"/>
+    <w:bookmarkStart w:id="106" w:name="conclusion"/>
     <w:p>
       <w:pPr>
         <w:pStyle w:val="Heading1"/>
@@ -11223,8 +11229,8 @@
         <w:br w:type="page"/>
       </w:r>
     </w:p>
-    <w:bookmarkEnd w:id="65"/>
-    <w:bookmarkStart w:id="83" w:name="X421aa8c25e75d5bda444d1508fbcc66cb0dedf6"/>
+    <w:bookmarkEnd w:id="106"/>
+    <w:bookmarkStart w:id="124" w:name="X421aa8c25e75d5bda444d1508fbcc66cb0dedf6"/>
     <w:p>
       <w:pPr>
         <w:pStyle w:val="Heading1"/>
@@ -11237,8 +11243,8 @@
       <w:pPr>
         <w:pStyle w:val="TableCaption"/>
       </w:pPr>
-      <w:bookmarkStart w:id="66" w:name="tab:stim-table-appendix"/>
-      <w:bookmarkEnd w:id="66"/>
+      <w:bookmarkStart w:id="107" w:name="tab:stim-table-appendix"/>
+      <w:bookmarkEnd w:id="107"/>
       <w:r>
         <w:t xml:space="preserve">Table 4: Stimulus List</w:t>
       </w:r>
@@ -16117,20 +16123,20 @@
       <w:r>
         <w:drawing>
           <wp:inline>
-            <wp:extent cx="4579632" cy="3663706"/>
+            <wp:extent cx="4579632" cy="3662179"/>
             <wp:effectExtent b="0" l="0" r="0" t="0"/>
-            <wp:docPr descr="Figure 6: Histogram of the adapted LexTALE scores" title="" id="68" name="Picture"/>
+            <wp:docPr descr="Figure 6: Histogram of the adapted LexTALE scores" title="" id="109" name="Picture"/>
             <a:graphic>
               <a:graphicData uri="http://schemas.openxmlformats.org/drawingml/2006/picture">
                 <pic:pic>
                   <pic:nvPicPr>
-                    <pic:cNvPr descr="main_files/589217832034fa56a3cbc71aedc0ba034523d09b.png" id="69" name="Picture"/>
+                    <pic:cNvPr descr="../plots/apapted_lextale_hist.png" id="110" name="Picture"/>
                     <pic:cNvPicPr>
                       <a:picLocks noChangeArrowheads="1" noChangeAspect="1"/>
                     </pic:cNvPicPr>
                   </pic:nvPicPr>
                   <pic:blipFill>
-                    <a:blip r:embed="rId67"/>
+                    <a:blip r:embed="rId108"/>
                     <a:stretch>
                       <a:fillRect/>
                     </a:stretch>
@@ -16138,7 +16144,7 @@
                   <pic:spPr bwMode="auto">
                     <a:xfrm>
                       <a:off x="0" y="0"/>
-                      <a:ext cx="4579632" cy="3663706"/>
+                      <a:ext cx="4579632" cy="3662179"/>
                     </a:xfrm>
                     <a:prstGeom prst="rect">
                       <a:avLst/>
@@ -16161,8 +16167,8 @@
       <w:pPr>
         <w:pStyle w:val="ImageCaption"/>
       </w:pPr>
-      <w:bookmarkStart w:id="70" w:name="fig:profplot"/>
-      <w:bookmarkEnd w:id="70"/>
+      <w:bookmarkStart w:id="111" w:name="fig:profplot"/>
+      <w:bookmarkEnd w:id="111"/>
       <w:r>
         <w:t xml:space="preserve">Figure 6: Histogram of the adapted LexTALE scores</w:t>
       </w:r>
@@ -16174,20 +16180,20 @@
       <w:r>
         <w:drawing>
           <wp:inline>
-            <wp:extent cx="4579632" cy="3663706"/>
+            <wp:extent cx="4579632" cy="3662179"/>
             <wp:effectExtent b="0" l="0" r="0" t="0"/>
-            <wp:docPr descr="Figure 7: Posterior Distributions of the accuracy model" title="" id="72" name="Picture"/>
+            <wp:docPr descr="Figure 7: Posterior Distributions of the accuracy model" title="" id="113" name="Picture"/>
             <a:graphic>
               <a:graphicData uri="http://schemas.openxmlformats.org/drawingml/2006/picture">
                 <pic:pic>
                   <pic:nvPicPr>
-                    <pic:cNvPr descr="main_files/e5718c37282eb0900570041746a9fcfac7891e90.png" id="73" name="Picture"/>
+                    <pic:cNvPr descr="../plots/acc_mod.png" id="114" name="Picture"/>
                     <pic:cNvPicPr>
                       <a:picLocks noChangeArrowheads="1" noChangeAspect="1"/>
                     </pic:cNvPicPr>
                   </pic:nvPicPr>
                   <pic:blipFill>
-                    <a:blip r:embed="rId71"/>
+                    <a:blip r:embed="rId112"/>
                     <a:stretch>
                       <a:fillRect/>
                     </a:stretch>
@@ -16195,7 +16201,7 @@
                   <pic:spPr bwMode="auto">
                     <a:xfrm>
                       <a:off x="0" y="0"/>
-                      <a:ext cx="4579632" cy="3663706"/>
+                      <a:ext cx="4579632" cy="3662179"/>
                     </a:xfrm>
                     <a:prstGeom prst="rect">
                       <a:avLst/>
@@ -16218,8 +16224,8 @@
       <w:pPr>
         <w:pStyle w:val="ImageCaption"/>
       </w:pPr>
-      <w:bookmarkStart w:id="74" w:name="fig:accmod"/>
-      <w:bookmarkEnd w:id="74"/>
+      <w:bookmarkStart w:id="115" w:name="fig:accmod"/>
+      <w:bookmarkEnd w:id="115"/>
       <w:r>
         <w:t xml:space="preserve">Figure 7: Posterior Distributions of the accuracy model</w:t>
       </w:r>
@@ -16231,20 +16237,20 @@
       <w:r>
         <w:drawing>
           <wp:inline>
-            <wp:extent cx="4579632" cy="3663706"/>
+            <wp:extent cx="4579632" cy="3662179"/>
             <wp:effectExtent b="0" l="0" r="0" t="0"/>
-            <wp:docPr descr="Figure 8: Posterior Distributions of the reaction time model" title="" id="76" name="Picture"/>
+            <wp:docPr descr="Figure 8: Posterior Distributions of the reaction time model" title="" id="117" name="Picture"/>
             <a:graphic>
               <a:graphicData uri="http://schemas.openxmlformats.org/drawingml/2006/picture">
                 <pic:pic>
                   <pic:nvPicPr>
-                    <pic:cNvPr descr="main_files/d25de41a0e83a31db0a06921246cb1a0e1e3a3a1.png" id="77" name="Picture"/>
+                    <pic:cNvPr descr="../plots/rt_mod.png" id="118" name="Picture"/>
                     <pic:cNvPicPr>
                       <a:picLocks noChangeArrowheads="1" noChangeAspect="1"/>
                     </pic:cNvPicPr>
                   </pic:nvPicPr>
                   <pic:blipFill>
-                    <a:blip r:embed="rId75"/>
+                    <a:blip r:embed="rId116"/>
                     <a:stretch>
                       <a:fillRect/>
                     </a:stretch>
@@ -16252,7 +16258,7 @@
                   <pic:spPr bwMode="auto">
                     <a:xfrm>
                       <a:off x="0" y="0"/>
-                      <a:ext cx="4579632" cy="3663706"/>
+                      <a:ext cx="4579632" cy="3662179"/>
                     </a:xfrm>
                     <a:prstGeom prst="rect">
                       <a:avLst/>
@@ -16275,8 +16281,8 @@
       <w:pPr>
         <w:pStyle w:val="ImageCaption"/>
       </w:pPr>
-      <w:bookmarkStart w:id="78" w:name="fig:retmod"/>
-      <w:bookmarkEnd w:id="78"/>
+      <w:bookmarkStart w:id="119" w:name="fig:retmod"/>
+      <w:bookmarkEnd w:id="119"/>
       <w:r>
         <w:t xml:space="preserve">Figure 8: Posterior Distributions of the reaction time model</w:t>
       </w:r>
@@ -16288,20 +16294,20 @@
       <w:r>
         <w:drawing>
           <wp:inline>
-            <wp:extent cx="4579632" cy="3663706"/>
+            <wp:extent cx="4579632" cy="3662179"/>
             <wp:effectExtent b="0" l="0" r="0" t="0"/>
-            <wp:docPr descr="Figure 9: Individual effects in reaction times as a function of L3 proficiency" title="" id="80" name="Picture"/>
+            <wp:docPr descr="Figure 9: Individual effects in reaction times as a function of L3 proficiency" title="" id="121" name="Picture"/>
             <a:graphic>
               <a:graphicData uri="http://schemas.openxmlformats.org/drawingml/2006/picture">
                 <pic:pic>
                   <pic:nvPicPr>
-                    <pic:cNvPr descr="main_files/0822df16491bbbe3cda5e4e40815b76e13c3534e.png" id="81" name="Picture"/>
+                    <pic:cNvPr descr="../plots/rt_prof.png" id="122" name="Picture"/>
                     <pic:cNvPicPr>
                       <a:picLocks noChangeArrowheads="1" noChangeAspect="1"/>
                     </pic:cNvPicPr>
                   </pic:nvPicPr>
                   <pic:blipFill>
-                    <a:blip r:embed="rId79"/>
+                    <a:blip r:embed="rId120"/>
                     <a:stretch>
                       <a:fillRect/>
                     </a:stretch>
@@ -16309,7 +16315,7 @@
                   <pic:spPr bwMode="auto">
                     <a:xfrm>
                       <a:off x="0" y="0"/>
-                      <a:ext cx="4579632" cy="3663706"/>
+                      <a:ext cx="4579632" cy="3662179"/>
                     </a:xfrm>
                     <a:prstGeom prst="rect">
                       <a:avLst/>
@@ -16332,8 +16338,8 @@
       <w:pPr>
         <w:pStyle w:val="ImageCaption"/>
       </w:pPr>
-      <w:bookmarkStart w:id="82" w:name="fig:indrtprof"/>
-      <w:bookmarkEnd w:id="82"/>
+      <w:bookmarkStart w:id="123" w:name="fig:indrtprof"/>
+      <w:bookmarkEnd w:id="123"/>
       <w:r>
         <w:t xml:space="preserve">Figure 9: Individual effects in reaction times as a function of L3 proficiency</w:t>
       </w:r>
@@ -16343,8 +16349,8 @@
         <w:br w:type="page"/>
       </w:r>
     </w:p>
-    <w:bookmarkEnd w:id="83"/>
-    <w:bookmarkStart w:id="200" w:name="references"/>
+    <w:bookmarkEnd w:id="124"/>
+    <w:bookmarkStart w:id="241" w:name="references"/>
     <w:p>
       <w:pPr>
         <w:pStyle w:val="Heading1"/>
@@ -16353,8 +16359,8 @@
         <w:t xml:space="preserve">References</w:t>
       </w:r>
     </w:p>
-    <w:bookmarkStart w:id="199" w:name="refs"/>
-    <w:bookmarkStart w:id="85" w:name="ref-aguinaga_echeverria_2017"/>
+    <w:bookmarkStart w:id="240" w:name="refs"/>
+    <w:bookmarkStart w:id="126" w:name="ref-aguinaga_echeverria_2017"/>
     <w:p>
       <w:pPr>
         <w:pStyle w:val="Bibliography"/>
@@ -16481,7 +16487,7 @@
       <w:r>
         <w:t xml:space="preserve"> </w:t>
       </w:r>
-      <w:hyperlink r:id="rId84">
+      <w:hyperlink r:id="rId125">
         <w:r>
           <w:rPr>
             <w:rStyle w:val="Hyperlink"/>
@@ -16490,8 +16496,8 @@
         </w:r>
       </w:hyperlink>
     </w:p>
-    <w:bookmarkEnd w:id="85"/>
-    <w:bookmarkStart w:id="87" w:name="ref-amengual_2012"/>
+    <w:bookmarkEnd w:id="126"/>
+    <w:bookmarkStart w:id="128" w:name="ref-amengual_2012"/>
     <w:p>
       <w:pPr>
         <w:pStyle w:val="Bibliography"/>
@@ -16537,7 +16543,7 @@
       <w:r>
         <w:t xml:space="preserve">(3), 517–530. http://doi.org/</w:t>
       </w:r>
-      <w:hyperlink r:id="rId86">
+      <w:hyperlink r:id="rId127">
         <w:r>
           <w:rPr>
             <w:rStyle w:val="Hyperlink"/>
@@ -16546,8 +16552,8 @@
         </w:r>
       </w:hyperlink>
     </w:p>
-    <w:bookmarkEnd w:id="87"/>
-    <w:bookmarkStart w:id="89" w:name="ref-arana_etal_2022"/>
+    <w:bookmarkEnd w:id="128"/>
+    <w:bookmarkStart w:id="130" w:name="ref-arana_etal_2022"/>
     <w:p>
       <w:pPr>
         <w:pStyle w:val="Bibliography"/>
@@ -16581,7 +16587,7 @@
       <w:r>
         <w:t xml:space="preserve">(4), 660–678. http://doi.org/</w:t>
       </w:r>
-      <w:hyperlink r:id="rId88">
+      <w:hyperlink r:id="rId129">
         <w:r>
           <w:rPr>
             <w:rStyle w:val="Hyperlink"/>
@@ -16590,8 +16596,8 @@
         </w:r>
       </w:hyperlink>
     </w:p>
-    <w:bookmarkEnd w:id="89"/>
-    <w:bookmarkStart w:id="91" w:name="ref-bardel_falk_2007"/>
+    <w:bookmarkEnd w:id="130"/>
+    <w:bookmarkStart w:id="132" w:name="ref-bardel_falk_2007"/>
     <w:p>
       <w:pPr>
         <w:pStyle w:val="Bibliography"/>
@@ -16649,7 +16655,7 @@
       <w:r>
         <w:t xml:space="preserve">, 459–484. http://doi.org/</w:t>
       </w:r>
-      <w:hyperlink r:id="rId90">
+      <w:hyperlink r:id="rId131">
         <w:r>
           <w:rPr>
             <w:rStyle w:val="Hyperlink"/>
@@ -16658,8 +16664,8 @@
         </w:r>
       </w:hyperlink>
     </w:p>
-    <w:bookmarkEnd w:id="91"/>
-    <w:bookmarkStart w:id="93" w:name="ref-bardel_falk_2012"/>
+    <w:bookmarkEnd w:id="132"/>
+    <w:bookmarkStart w:id="134" w:name="ref-bardel_falk_2012"/>
     <w:p>
       <w:pPr>
         <w:pStyle w:val="Bibliography"/>
@@ -16679,7 +16685,7 @@
       <w:r>
         <w:t xml:space="preserve">status factor and the declarative/procedural distinction. In (pp. 61–78). http://doi.org/</w:t>
       </w:r>
-      <w:hyperlink r:id="rId92">
+      <w:hyperlink r:id="rId133">
         <w:r>
           <w:rPr>
             <w:rStyle w:val="Hyperlink"/>
@@ -16688,8 +16694,8 @@
         </w:r>
       </w:hyperlink>
     </w:p>
-    <w:bookmarkEnd w:id="93"/>
-    <w:bookmarkStart w:id="95" w:name="ref-bartolotti_marian_2017"/>
+    <w:bookmarkEnd w:id="134"/>
+    <w:bookmarkStart w:id="136" w:name="ref-bartolotti_marian_2017"/>
     <w:p>
       <w:pPr>
         <w:pStyle w:val="Bibliography"/>
@@ -16774,7 +16780,7 @@
       <w:r>
         <w:t xml:space="preserve">(1), 110–140. http://doi.org/</w:t>
       </w:r>
-      <w:hyperlink r:id="rId94">
+      <w:hyperlink r:id="rId135">
         <w:r>
           <w:rPr>
             <w:rStyle w:val="Hyperlink"/>
@@ -16783,8 +16789,8 @@
         </w:r>
       </w:hyperlink>
     </w:p>
-    <w:bookmarkEnd w:id="95"/>
-    <w:bookmarkStart w:id="96" w:name="ref-borg2013acquisition"/>
+    <w:bookmarkEnd w:id="136"/>
+    <w:bookmarkStart w:id="137" w:name="ref-borg2013acquisition"/>
     <w:p>
       <w:pPr>
         <w:pStyle w:val="Bibliography"/>
@@ -16809,8 +16815,8 @@
         <w:t xml:space="preserve">(pp. 11–21). Cascadilla Proceedings Project Somerville, MA.</w:t>
       </w:r>
     </w:p>
-    <w:bookmarkEnd w:id="96"/>
-    <w:bookmarkStart w:id="97" w:name="ref-burkner2017brms"/>
+    <w:bookmarkEnd w:id="137"/>
+    <w:bookmarkStart w:id="138" w:name="ref-burkner2017brms"/>
     <w:p>
       <w:pPr>
         <w:pStyle w:val="Bibliography"/>
@@ -16845,8 +16851,8 @@
         <w:t xml:space="preserve">, 1–28.</w:t>
       </w:r>
     </w:p>
-    <w:bookmarkEnd w:id="97"/>
-    <w:bookmarkStart w:id="98" w:name="ref-cabrelli2015relationship"/>
+    <w:bookmarkEnd w:id="138"/>
+    <w:bookmarkStart w:id="139" w:name="ref-cabrelli2015relationship"/>
     <w:p>
       <w:pPr>
         <w:pStyle w:val="Bibliography"/>
@@ -16871,8 +16877,8 @@
         <w:t xml:space="preserve">(pp. 21–52). John Benjamins.</w:t>
       </w:r>
     </w:p>
-    <w:bookmarkEnd w:id="98"/>
-    <w:bookmarkStart w:id="100" w:name="ref-carrasco-ortiz_etal_2021"/>
+    <w:bookmarkEnd w:id="139"/>
+    <w:bookmarkStart w:id="141" w:name="ref-carrasco-ortiz_etal_2021"/>
     <w:p>
       <w:pPr>
         <w:pStyle w:val="Bibliography"/>
@@ -16918,7 +16924,7 @@
       <w:r>
         <w:t xml:space="preserve">(3), 389–417. http://doi.org/</w:t>
       </w:r>
-      <w:hyperlink r:id="rId99">
+      <w:hyperlink r:id="rId140">
         <w:r>
           <w:rPr>
             <w:rStyle w:val="Hyperlink"/>
@@ -16927,8 +16933,8 @@
         </w:r>
       </w:hyperlink>
     </w:p>
-    <w:bookmarkEnd w:id="100"/>
-    <w:bookmarkStart w:id="102" w:name="ref-comesana_etal_2015"/>
+    <w:bookmarkEnd w:id="141"/>
+    <w:bookmarkStart w:id="143" w:name="ref-comesana_etal_2015"/>
     <w:p>
       <w:pPr>
         <w:pStyle w:val="Bibliography"/>
@@ -16974,7 +16980,7 @@
       <w:r>
         <w:t xml:space="preserve">(3), 614–635. http://doi.org/</w:t>
       </w:r>
-      <w:hyperlink r:id="rId101">
+      <w:hyperlink r:id="rId142">
         <w:r>
           <w:rPr>
             <w:rStyle w:val="Hyperlink"/>
@@ -16983,8 +16989,8 @@
         </w:r>
       </w:hyperlink>
     </w:p>
-    <w:bookmarkEnd w:id="102"/>
-    <w:bookmarkStart w:id="104" w:name="ref-cop_etal_2015"/>
+    <w:bookmarkEnd w:id="143"/>
+    <w:bookmarkStart w:id="145" w:name="ref-cop_etal_2015"/>
     <w:p>
       <w:pPr>
         <w:pStyle w:val="Bibliography"/>
@@ -17108,7 +17114,7 @@
       <w:r>
         <w:t xml:space="preserve">(8), e0134008. http://doi.org/</w:t>
       </w:r>
-      <w:hyperlink r:id="rId103">
+      <w:hyperlink r:id="rId144">
         <w:r>
           <w:rPr>
             <w:rStyle w:val="Hyperlink"/>
@@ -17117,8 +17123,8 @@
         </w:r>
       </w:hyperlink>
     </w:p>
-    <w:bookmarkEnd w:id="104"/>
-    <w:bookmarkStart w:id="106" w:name="ref-cornut_etal_2022"/>
+    <w:bookmarkEnd w:id="145"/>
+    <w:bookmarkStart w:id="147" w:name="ref-cornut_etal_2022"/>
     <w:p>
       <w:pPr>
         <w:pStyle w:val="Bibliography"/>
@@ -17182,7 +17188,7 @@
       <w:r>
         <w:t xml:space="preserve">(1), 121–136. http://doi.org/</w:t>
       </w:r>
-      <w:hyperlink r:id="rId105">
+      <w:hyperlink r:id="rId146">
         <w:r>
           <w:rPr>
             <w:rStyle w:val="Hyperlink"/>
@@ -17191,8 +17197,8 @@
         </w:r>
       </w:hyperlink>
     </w:p>
-    <w:bookmarkEnd w:id="106"/>
-    <w:bookmarkStart w:id="108" w:name="ref-costa_etal_2023"/>
+    <w:bookmarkEnd w:id="147"/>
+    <w:bookmarkStart w:id="149" w:name="ref-costa_etal_2023"/>
     <w:p>
       <w:pPr>
         <w:pStyle w:val="Bibliography"/>
@@ -17286,7 +17292,7 @@
       <w:r>
         <w:t xml:space="preserve">(7), 3699–3725. http://doi.org/</w:t>
       </w:r>
-      <w:hyperlink r:id="rId107">
+      <w:hyperlink r:id="rId148">
         <w:r>
           <w:rPr>
             <w:rStyle w:val="Hyperlink"/>
@@ -17295,8 +17301,8 @@
         </w:r>
       </w:hyperlink>
     </w:p>
-    <w:bookmarkEnd w:id="108"/>
-    <w:bookmarkStart w:id="109" w:name="ref-costa_etal_2000"/>
+    <w:bookmarkEnd w:id="149"/>
+    <w:bookmarkStart w:id="150" w:name="ref-costa_etal_2000"/>
     <w:p>
       <w:pPr>
         <w:pStyle w:val="Bibliography"/>
@@ -17365,8 +17371,8 @@
         <w:t xml:space="preserve">.</w:t>
       </w:r>
     </w:p>
-    <w:bookmarkEnd w:id="109"/>
-    <w:bookmarkStart w:id="110" w:name="ref-covey_mikheeva_2023"/>
+    <w:bookmarkEnd w:id="150"/>
+    <w:bookmarkStart w:id="151" w:name="ref-covey_mikheeva_2023"/>
     <w:p>
       <w:pPr>
         <w:pStyle w:val="Bibliography"/>
@@ -17391,8 +17397,8 @@
         <w:t xml:space="preserve">(pp. 187–199). Cascadilla Press.</w:t>
       </w:r>
     </w:p>
-    <w:bookmarkEnd w:id="110"/>
-    <w:bookmarkStart w:id="111" w:name="ref-cuetos_etal_2011"/>
+    <w:bookmarkEnd w:id="151"/>
+    <w:bookmarkStart w:id="152" w:name="ref-cuetos_etal_2011"/>
     <w:p>
       <w:pPr>
         <w:pStyle w:val="Bibliography"/>
@@ -17454,8 +17460,8 @@
         <w:t xml:space="preserve">(2), 133–143.</w:t>
       </w:r>
     </w:p>
-    <w:bookmarkEnd w:id="111"/>
-    <w:bookmarkStart w:id="113" w:name="ref-de_angelis_2007"/>
+    <w:bookmarkEnd w:id="152"/>
+    <w:bookmarkStart w:id="154" w:name="ref-de_angelis_2007"/>
     <w:p>
       <w:pPr>
         <w:pStyle w:val="Bibliography"/>
@@ -17518,7 +17524,7 @@
       <w:r>
         <w:t xml:space="preserve">. (D. Singleton, Ed.). Multilingual Matters &amp; Channel View Publications. http://doi.org/</w:t>
       </w:r>
-      <w:hyperlink r:id="rId112">
+      <w:hyperlink r:id="rId153">
         <w:r>
           <w:rPr>
             <w:rStyle w:val="Hyperlink"/>
@@ -17527,8 +17533,8 @@
         </w:r>
       </w:hyperlink>
     </w:p>
-    <w:bookmarkEnd w:id="113"/>
-    <w:bookmarkStart w:id="115" w:name="ref-dijkstra_etal_2010"/>
+    <w:bookmarkEnd w:id="154"/>
+    <w:bookmarkStart w:id="156" w:name="ref-dijkstra_etal_2010"/>
     <w:p>
       <w:pPr>
         <w:pStyle w:val="Bibliography"/>
@@ -17562,7 +17568,7 @@
       <w:r>
         <w:t xml:space="preserve">(3), 284–301. http://doi.org/</w:t>
       </w:r>
-      <w:hyperlink r:id="rId114">
+      <w:hyperlink r:id="rId155">
         <w:r>
           <w:rPr>
             <w:rStyle w:val="Hyperlink"/>
@@ -17571,8 +17577,8 @@
         </w:r>
       </w:hyperlink>
     </w:p>
-    <w:bookmarkEnd w:id="115"/>
-    <w:bookmarkStart w:id="117" w:name="ref-dijkstra_vanheuven_2002"/>
+    <w:bookmarkEnd w:id="156"/>
+    <w:bookmarkStart w:id="158" w:name="ref-dijkstra_vanheuven_2002"/>
     <w:p>
       <w:pPr>
         <w:pStyle w:val="Bibliography"/>
@@ -17618,7 +17624,7 @@
       <w:r>
         <w:t xml:space="preserve">(3), 175–197. http://doi.org/</w:t>
       </w:r>
-      <w:hyperlink r:id="rId116">
+      <w:hyperlink r:id="rId157">
         <w:r>
           <w:rPr>
             <w:rStyle w:val="Hyperlink"/>
@@ -17627,8 +17633,8 @@
         </w:r>
       </w:hyperlink>
     </w:p>
-    <w:bookmarkEnd w:id="117"/>
-    <w:bookmarkStart w:id="118" w:name="ref-Dijkstra_etal_2018"/>
+    <w:bookmarkEnd w:id="158"/>
+    <w:bookmarkStart w:id="159" w:name="ref-Dijkstra_etal_2018"/>
     <w:p>
       <w:pPr>
         <w:pStyle w:val="Bibliography"/>
@@ -17663,8 +17669,8 @@
         <w:t xml:space="preserve">(4), 657–679.</w:t>
       </w:r>
     </w:p>
-    <w:bookmarkEnd w:id="118"/>
-    <w:bookmarkStart w:id="120" w:name="ref-ecke_2015"/>
+    <w:bookmarkEnd w:id="159"/>
+    <w:bookmarkStart w:id="161" w:name="ref-ecke_2015"/>
     <w:p>
       <w:pPr>
         <w:pStyle w:val="Bibliography"/>
@@ -17698,7 +17704,7 @@
       <w:r>
         <w:t xml:space="preserve">(2), 145–162. http://doi.org/</w:t>
       </w:r>
-      <w:hyperlink r:id="rId119">
+      <w:hyperlink r:id="rId160">
         <w:r>
           <w:rPr>
             <w:rStyle w:val="Hyperlink"/>
@@ -17707,8 +17713,8 @@
         </w:r>
       </w:hyperlink>
     </w:p>
-    <w:bookmarkEnd w:id="120"/>
-    <w:bookmarkStart w:id="122" w:name="ref-ellis_beaton_1993"/>
+    <w:bookmarkEnd w:id="161"/>
+    <w:bookmarkStart w:id="163" w:name="ref-ellis_beaton_1993"/>
     <w:p>
       <w:pPr>
         <w:pStyle w:val="Bibliography"/>
@@ -17754,7 +17760,7 @@
       <w:r>
         <w:t xml:space="preserve">(3), 533–558. http://doi.org/</w:t>
       </w:r>
-      <w:hyperlink r:id="rId121">
+      <w:hyperlink r:id="rId162">
         <w:r>
           <w:rPr>
             <w:rStyle w:val="Hyperlink"/>
@@ -17763,8 +17769,8 @@
         </w:r>
       </w:hyperlink>
     </w:p>
-    <w:bookmarkEnd w:id="122"/>
-    <w:bookmarkStart w:id="124" w:name="ref-engemann_rodetzky_2024"/>
+    <w:bookmarkEnd w:id="163"/>
+    <w:bookmarkStart w:id="165" w:name="ref-engemann_rodetzky_2024"/>
     <w:p>
       <w:pPr>
         <w:pStyle w:val="Bibliography"/>
@@ -17855,7 +17861,7 @@
       <w:r>
         <w:t xml:space="preserve">(10). http://doi.org/</w:t>
       </w:r>
-      <w:hyperlink r:id="rId123">
+      <w:hyperlink r:id="rId164">
         <w:r>
           <w:rPr>
             <w:rStyle w:val="Hyperlink"/>
@@ -17864,8 +17870,8 @@
         </w:r>
       </w:hyperlink>
     </w:p>
-    <w:bookmarkEnd w:id="124"/>
-    <w:bookmarkStart w:id="125" w:name="ref-foote2009transfer"/>
+    <w:bookmarkEnd w:id="165"/>
+    <w:bookmarkStart w:id="166" w:name="ref-foote2009transfer"/>
     <w:p>
       <w:pPr>
         <w:pStyle w:val="Bibliography"/>
@@ -17900,8 +17906,8 @@
         <w:t xml:space="preserve">, 89.</w:t>
       </w:r>
     </w:p>
-    <w:bookmarkEnd w:id="125"/>
-    <w:bookmarkStart w:id="127" w:name="ref-forys-nogala_etal_2026"/>
+    <w:bookmarkEnd w:id="166"/>
+    <w:bookmarkStart w:id="168" w:name="ref-forys-nogala_etal_2026"/>
     <w:p>
       <w:pPr>
         <w:pStyle w:val="Bibliography"/>
@@ -18013,7 +18019,7 @@
       <w:r>
         <w:t xml:space="preserve">(2), 367–380. http://doi.org/</w:t>
       </w:r>
-      <w:hyperlink r:id="rId126">
+      <w:hyperlink r:id="rId167">
         <w:r>
           <w:rPr>
             <w:rStyle w:val="Hyperlink"/>
@@ -18022,8 +18028,8 @@
         </w:r>
       </w:hyperlink>
     </w:p>
-    <w:bookmarkEnd w:id="127"/>
-    <w:bookmarkStart w:id="129" w:name="ref-frances_etal_2021"/>
+    <w:bookmarkEnd w:id="168"/>
+    <w:bookmarkStart w:id="170" w:name="ref-frances_etal_2021"/>
     <w:p>
       <w:pPr>
         <w:pStyle w:val="Bibliography"/>
@@ -18069,7 +18075,7 @@
       <w:r>
         <w:t xml:space="preserve">(1), 12812. http://doi.org/</w:t>
       </w:r>
-      <w:hyperlink r:id="rId128">
+      <w:hyperlink r:id="rId169">
         <w:r>
           <w:rPr>
             <w:rStyle w:val="Hyperlink"/>
@@ -18078,8 +18084,8 @@
         </w:r>
       </w:hyperlink>
     </w:p>
-    <w:bookmarkEnd w:id="129"/>
-    <w:bookmarkStart w:id="131" w:name="ref-frances_etal_2022"/>
+    <w:bookmarkEnd w:id="170"/>
+    <w:bookmarkStart w:id="172" w:name="ref-frances_etal_2022"/>
     <w:p>
       <w:pPr>
         <w:pStyle w:val="Bibliography"/>
@@ -18212,7 +18218,7 @@
       <w:r>
         <w:t xml:space="preserve">. http://doi.org/</w:t>
       </w:r>
-      <w:hyperlink r:id="rId130">
+      <w:hyperlink r:id="rId171">
         <w:r>
           <w:rPr>
             <w:rStyle w:val="Hyperlink"/>
@@ -18221,8 +18227,8 @@
         </w:r>
       </w:hyperlink>
     </w:p>
-    <w:bookmarkEnd w:id="131"/>
-    <w:bookmarkStart w:id="132" w:name="ref-de2014subject"/>
+    <w:bookmarkEnd w:id="172"/>
+    <w:bookmarkStart w:id="173" w:name="ref-de2014subject"/>
     <w:p>
       <w:pPr>
         <w:pStyle w:val="Bibliography"/>
@@ -18244,8 +18250,8 @@
         <w:t xml:space="preserve">.</w:t>
       </w:r>
     </w:p>
-    <w:bookmarkEnd w:id="132"/>
-    <w:bookmarkStart w:id="133" w:name="ref-garcia2015object"/>
+    <w:bookmarkEnd w:id="173"/>
+    <w:bookmarkStart w:id="174" w:name="ref-garcia2015object"/>
     <w:p>
       <w:pPr>
         <w:pStyle w:val="Bibliography"/>
@@ -18280,8 +18286,8 @@
         <w:t xml:space="preserve">(5), 483–498.</w:t>
       </w:r>
     </w:p>
-    <w:bookmarkEnd w:id="133"/>
-    <w:bookmarkStart w:id="135" w:name="ref-garrido-pozu_2024"/>
+    <w:bookmarkEnd w:id="174"/>
+    <w:bookmarkStart w:id="176" w:name="ref-garrido-pozu_2024"/>
     <w:p>
       <w:pPr>
         <w:pStyle w:val="Bibliography"/>
@@ -18333,7 +18339,7 @@
       <w:r>
         <w:t xml:space="preserve">(5), 914–926. http://doi.org/</w:t>
       </w:r>
-      <w:hyperlink r:id="rId134">
+      <w:hyperlink r:id="rId175">
         <w:r>
           <w:rPr>
             <w:rStyle w:val="Hyperlink"/>
@@ -18342,8 +18348,8 @@
         </w:r>
       </w:hyperlink>
     </w:p>
-    <w:bookmarkEnd w:id="135"/>
-    <w:bookmarkStart w:id="136" w:name="ref-giancaspro2015transfer"/>
+    <w:bookmarkEnd w:id="176"/>
+    <w:bookmarkStart w:id="177" w:name="ref-giancaspro2015transfer"/>
     <w:p>
       <w:pPr>
         <w:pStyle w:val="Bibliography"/>
@@ -18378,8 +18384,8 @@
         <w:t xml:space="preserve">(2), 191–207.</w:t>
       </w:r>
     </w:p>
-    <w:bookmarkEnd w:id="136"/>
-    <w:bookmarkStart w:id="138" w:name="ref-van_hell_degroot_2008"/>
+    <w:bookmarkEnd w:id="177"/>
+    <w:bookmarkStart w:id="179" w:name="ref-van_hell_degroot_2008"/>
     <w:p>
       <w:pPr>
         <w:pStyle w:val="Bibliography"/>
@@ -18413,7 +18419,7 @@
       <w:r>
         <w:t xml:space="preserve">(3), 431–451. http://doi.org/</w:t>
       </w:r>
-      <w:hyperlink r:id="rId137">
+      <w:hyperlink r:id="rId178">
         <w:r>
           <w:rPr>
             <w:rStyle w:val="Hyperlink"/>
@@ -18422,8 +18428,8 @@
         </w:r>
       </w:hyperlink>
     </w:p>
-    <w:bookmarkEnd w:id="138"/>
-    <w:bookmarkStart w:id="139" w:name="ref-hermas2010language"/>
+    <w:bookmarkEnd w:id="179"/>
+    <w:bookmarkStart w:id="180" w:name="ref-hermas2010language"/>
     <w:p>
       <w:pPr>
         <w:pStyle w:val="Bibliography"/>
@@ -18458,8 +18464,8 @@
         <w:t xml:space="preserve">(4), 343–362.</w:t>
       </w:r>
     </w:p>
-    <w:bookmarkEnd w:id="139"/>
-    <w:bookmarkStart w:id="140" w:name="ref-ionin2015interpretation"/>
+    <w:bookmarkEnd w:id="180"/>
+    <w:bookmarkStart w:id="181" w:name="ref-ionin2015interpretation"/>
     <w:p>
       <w:pPr>
         <w:pStyle w:val="Bibliography"/>
@@ -18494,8 +18500,8 @@
         <w:t xml:space="preserve">(2), 215–251.</w:t>
       </w:r>
     </w:p>
-    <w:bookmarkEnd w:id="140"/>
-    <w:bookmarkStart w:id="141" w:name="ref-izura_etal_2014"/>
+    <w:bookmarkEnd w:id="181"/>
+    <w:bookmarkStart w:id="182" w:name="ref-izura_etal_2014"/>
     <w:p>
       <w:pPr>
         <w:pStyle w:val="Bibliography"/>
@@ -18560,8 +18566,8 @@
         <w:t xml:space="preserve">(1), 49–66.</w:t>
       </w:r>
     </w:p>
-    <w:bookmarkEnd w:id="141"/>
-    <w:bookmarkStart w:id="142" w:name="ref-jensen2023crosslinguistic"/>
+    <w:bookmarkEnd w:id="182"/>
+    <w:bookmarkStart w:id="183" w:name="ref-jensen2023crosslinguistic"/>
     <w:p>
       <w:pPr>
         <w:pStyle w:val="Bibliography"/>
@@ -18596,8 +18602,8 @@
         <w:t xml:space="preserve">(3), 717–734.</w:t>
       </w:r>
     </w:p>
-    <w:bookmarkEnd w:id="142"/>
-    <w:bookmarkStart w:id="144" w:name="ref-koutamanis_etal_2024"/>
+    <w:bookmarkEnd w:id="183"/>
+    <w:bookmarkStart w:id="185" w:name="ref-koutamanis_etal_2024"/>
     <w:p>
       <w:pPr>
         <w:pStyle w:val="Bibliography"/>
@@ -18643,7 +18649,7 @@
       <w:r>
         <w:t xml:space="preserve">(3), 489–515. http://doi.org/</w:t>
       </w:r>
-      <w:hyperlink r:id="rId143">
+      <w:hyperlink r:id="rId184">
         <w:r>
           <w:rPr>
             <w:rStyle w:val="Hyperlink"/>
@@ -18652,8 +18658,8 @@
         </w:r>
       </w:hyperlink>
     </w:p>
-    <w:bookmarkEnd w:id="144"/>
-    <w:bookmarkStart w:id="145" w:name="ref-kruschke2018rejecting"/>
+    <w:bookmarkEnd w:id="185"/>
+    <w:bookmarkStart w:id="186" w:name="ref-kruschke2018rejecting"/>
     <w:p>
       <w:pPr>
         <w:pStyle w:val="Bibliography"/>
@@ -18688,8 +18694,8 @@
         <w:t xml:space="preserve">(2), 270–280.</w:t>
       </w:r>
     </w:p>
-    <w:bookmarkEnd w:id="145"/>
-    <w:bookmarkStart w:id="147" w:name="ref-lemhofer_broersma_2012"/>
+    <w:bookmarkEnd w:id="186"/>
+    <w:bookmarkStart w:id="188" w:name="ref-lemhofer_broersma_2012"/>
     <w:p>
       <w:pPr>
         <w:pStyle w:val="Bibliography"/>
@@ -18789,7 +18795,7 @@
       <w:r>
         <w:t xml:space="preserve">(2), 325–343. http://doi.org/</w:t>
       </w:r>
-      <w:hyperlink r:id="rId146">
+      <w:hyperlink r:id="rId187">
         <w:r>
           <w:rPr>
             <w:rStyle w:val="Hyperlink"/>
@@ -18798,8 +18804,8 @@
         </w:r>
       </w:hyperlink>
     </w:p>
-    <w:bookmarkEnd w:id="147"/>
-    <w:bookmarkStart w:id="149" w:name="ref-lemhoefer_etal_2004"/>
+    <w:bookmarkEnd w:id="188"/>
+    <w:bookmarkStart w:id="190" w:name="ref-lemhoefer_etal_2004"/>
     <w:p>
       <w:pPr>
         <w:pStyle w:val="Bibliography"/>
@@ -18854,7 +18860,7 @@
       <w:r>
         <w:t xml:space="preserve">(5), 585–611. http://doi.org/</w:t>
       </w:r>
-      <w:hyperlink r:id="rId148">
+      <w:hyperlink r:id="rId189">
         <w:r>
           <w:rPr>
             <w:rStyle w:val="Hyperlink"/>
@@ -18863,8 +18869,8 @@
         </w:r>
       </w:hyperlink>
     </w:p>
-    <w:bookmarkEnd w:id="149"/>
-    <w:bookmarkStart w:id="151" w:name="ref-lijewska_2023"/>
+    <w:bookmarkEnd w:id="190"/>
+    <w:bookmarkStart w:id="192" w:name="ref-lijewska_2023"/>
     <w:p>
       <w:pPr>
         <w:pStyle w:val="Bibliography"/>
@@ -18910,7 +18916,7 @@
       <w:r>
         <w:t xml:space="preserve">(4), 1235–1263. http://doi.org/</w:t>
       </w:r>
-      <w:hyperlink r:id="rId150">
+      <w:hyperlink r:id="rId191">
         <w:r>
           <w:rPr>
             <w:rStyle w:val="Hyperlink"/>
@@ -18919,8 +18925,8 @@
         </w:r>
       </w:hyperlink>
     </w:p>
-    <w:bookmarkEnd w:id="151"/>
-    <w:bookmarkStart w:id="153" w:name="ref-lijewska_delouw_2025"/>
+    <w:bookmarkEnd w:id="192"/>
+    <w:bookmarkStart w:id="194" w:name="ref-lijewska_delouw_2025"/>
     <w:p>
       <w:pPr>
         <w:pStyle w:val="Bibliography"/>
@@ -18963,7 +18969,7 @@
       <w:r>
         <w:t xml:space="preserve">(5), 632–661. http://doi.org/</w:t>
       </w:r>
-      <w:hyperlink r:id="rId152">
+      <w:hyperlink r:id="rId193">
         <w:r>
           <w:rPr>
             <w:rStyle w:val="Hyperlink"/>
@@ -18972,8 +18978,8 @@
         </w:r>
       </w:hyperlink>
     </w:p>
-    <w:bookmarkEnd w:id="153"/>
-    <w:bookmarkStart w:id="155" w:name="ref-lotto_degroot_1998"/>
+    <w:bookmarkEnd w:id="194"/>
+    <w:bookmarkStart w:id="196" w:name="ref-lotto_degroot_1998"/>
     <w:p>
       <w:pPr>
         <w:pStyle w:val="Bibliography"/>
@@ -19007,7 +19013,7 @@
       <w:r>
         <w:t xml:space="preserve">(1), 31–69. http://doi.org/</w:t>
       </w:r>
-      <w:hyperlink r:id="rId154">
+      <w:hyperlink r:id="rId195">
         <w:r>
           <w:rPr>
             <w:rStyle w:val="Hyperlink"/>
@@ -19016,8 +19022,8 @@
         </w:r>
       </w:hyperlink>
     </w:p>
-    <w:bookmarkEnd w:id="155"/>
-    <w:bookmarkStart w:id="156" w:name="ref-makowski2019indices"/>
+    <w:bookmarkEnd w:id="196"/>
+    <w:bookmarkStart w:id="197" w:name="ref-makowski2019indices"/>
     <w:p>
       <w:pPr>
         <w:pStyle w:val="Bibliography"/>
@@ -19052,8 +19058,8 @@
         <w:t xml:space="preserve">, 2767.</w:t>
       </w:r>
     </w:p>
-    <w:bookmarkEnd w:id="156"/>
-    <w:bookmarkStart w:id="157" w:name="ref-marian2007language"/>
+    <w:bookmarkEnd w:id="197"/>
+    <w:bookmarkStart w:id="198" w:name="ref-marian2007language"/>
     <w:p>
       <w:pPr>
         <w:pStyle w:val="Bibliography"/>
@@ -19075,8 +19081,8 @@
         <w:t xml:space="preserve">.</w:t>
       </w:r>
     </w:p>
-    <w:bookmarkEnd w:id="157"/>
-    <w:bookmarkStart w:id="158" w:name="ref-mitrofanova2023crosslinguistic"/>
+    <w:bookmarkEnd w:id="198"/>
+    <w:bookmarkStart w:id="199" w:name="ref-mitrofanova2023crosslinguistic"/>
     <w:p>
       <w:pPr>
         <w:pStyle w:val="Bibliography"/>
@@ -19111,8 +19117,8 @@
         <w:t xml:space="preserve">(5), 717–742.</w:t>
       </w:r>
     </w:p>
-    <w:bookmarkEnd w:id="158"/>
-    <w:bookmarkStart w:id="160" w:name="ref-MontrulDiasSantos2011"/>
+    <w:bookmarkEnd w:id="199"/>
+    <w:bookmarkStart w:id="201" w:name="ref-MontrulDiasSantos2011"/>
     <w:p>
       <w:pPr>
         <w:pStyle w:val="Bibliography"/>
@@ -19146,7 +19152,7 @@
       <w:r>
         <w:t xml:space="preserve">(1), 21–58. http://doi.org/</w:t>
       </w:r>
-      <w:hyperlink r:id="rId159">
+      <w:hyperlink r:id="rId200">
         <w:r>
           <w:rPr>
             <w:rStyle w:val="Hyperlink"/>
@@ -19155,8 +19161,8 @@
         </w:r>
       </w:hyperlink>
     </w:p>
-    <w:bookmarkEnd w:id="160"/>
-    <w:bookmarkStart w:id="162" w:name="ref-muntendam_etal_2022"/>
+    <w:bookmarkEnd w:id="201"/>
+    <w:bookmarkStart w:id="203" w:name="ref-muntendam_etal_2022"/>
     <w:p>
       <w:pPr>
         <w:pStyle w:val="Bibliography"/>
@@ -19223,7 +19229,7 @@
       <w:r>
         <w:t xml:space="preserve">, 1–12. http://doi.org/</w:t>
       </w:r>
-      <w:hyperlink r:id="rId161">
+      <w:hyperlink r:id="rId202">
         <w:r>
           <w:rPr>
             <w:rStyle w:val="Hyperlink"/>
@@ -19232,8 +19238,8 @@
         </w:r>
       </w:hyperlink>
     </w:p>
-    <w:bookmarkEnd w:id="162"/>
-    <w:bookmarkStart w:id="164" w:name="ref-new_etal_2024"/>
+    <w:bookmarkEnd w:id="203"/>
+    <w:bookmarkStart w:id="205" w:name="ref-new_etal_2024"/>
     <w:p>
       <w:pPr>
         <w:pStyle w:val="Bibliography"/>
@@ -19288,7 +19294,7 @@
       <w:r>
         <w:t xml:space="preserve">(2), 278–286. http://doi.org/</w:t>
       </w:r>
-      <w:hyperlink r:id="rId163">
+      <w:hyperlink r:id="rId204">
         <w:r>
           <w:rPr>
             <w:rStyle w:val="Hyperlink"/>
@@ -19297,8 +19303,8 @@
         </w:r>
       </w:hyperlink>
     </w:p>
-    <w:bookmarkEnd w:id="164"/>
-    <w:bookmarkStart w:id="166" w:name="ref-otwinowska_szewczyk_2019"/>
+    <w:bookmarkEnd w:id="205"/>
+    <w:bookmarkStart w:id="207" w:name="ref-otwinowska_szewczyk_2019"/>
     <w:p>
       <w:pPr>
         <w:pStyle w:val="Bibliography"/>
@@ -19344,7 +19350,7 @@
       <w:r>
         <w:t xml:space="preserve">(8), 974–991. http://doi.org/</w:t>
       </w:r>
-      <w:hyperlink r:id="rId165">
+      <w:hyperlink r:id="rId206">
         <w:r>
           <w:rPr>
             <w:rStyle w:val="Hyperlink"/>
@@ -19353,8 +19359,8 @@
         </w:r>
       </w:hyperlink>
     </w:p>
-    <w:bookmarkEnd w:id="166"/>
-    <w:bookmarkStart w:id="167" w:name="ref-parma2017cross"/>
+    <w:bookmarkEnd w:id="207"/>
+    <w:bookmarkStart w:id="208" w:name="ref-parma2017cross"/>
     <w:p>
       <w:pPr>
         <w:pStyle w:val="Bibliography"/>
@@ -19389,8 +19395,8 @@
         <w:t xml:space="preserve">(3), 14.</w:t>
       </w:r>
     </w:p>
-    <w:bookmarkEnd w:id="167"/>
-    <w:bookmarkStart w:id="168" w:name="ref-parrish2024statistical"/>
+    <w:bookmarkEnd w:id="208"/>
+    <w:bookmarkStart w:id="209" w:name="ref-parrish2024statistical"/>
     <w:p>
       <w:pPr>
         <w:pStyle w:val="Bibliography"/>
@@ -19425,8 +19431,8 @@
         <w:t xml:space="preserve">(5), 1439–1456.</w:t>
       </w:r>
     </w:p>
-    <w:bookmarkEnd w:id="168"/>
-    <w:bookmarkStart w:id="169" w:name="ref-parrish2024production"/>
+    <w:bookmarkEnd w:id="209"/>
+    <w:bookmarkStart w:id="210" w:name="ref-parrish2024production"/>
     <w:p>
       <w:pPr>
         <w:pStyle w:val="Bibliography"/>
@@ -19461,8 +19467,8 @@
         <w:t xml:space="preserve">(1), 131–148.</w:t>
       </w:r>
     </w:p>
-    <w:bookmarkEnd w:id="169"/>
-    <w:bookmarkStart w:id="171" w:name="ref-peeters_etal_2013"/>
+    <w:bookmarkEnd w:id="210"/>
+    <w:bookmarkStart w:id="212" w:name="ref-peeters_etal_2013"/>
     <w:p>
       <w:pPr>
         <w:pStyle w:val="Bibliography"/>
@@ -19520,7 +19526,7 @@
       <w:r>
         <w:t xml:space="preserve">(4), 315–332. http://doi.org/</w:t>
       </w:r>
-      <w:hyperlink r:id="rId170">
+      <w:hyperlink r:id="rId211">
         <w:r>
           <w:rPr>
             <w:rStyle w:val="Hyperlink"/>
@@ -19529,8 +19535,8 @@
         </w:r>
       </w:hyperlink>
     </w:p>
-    <w:bookmarkEnd w:id="171"/>
-    <w:bookmarkStart w:id="173" w:name="ref-peirce_2019"/>
+    <w:bookmarkEnd w:id="212"/>
+    <w:bookmarkStart w:id="214" w:name="ref-peirce_2019"/>
     <w:p>
       <w:pPr>
         <w:pStyle w:val="Bibliography"/>
@@ -19585,7 +19591,7 @@
       <w:r>
         <w:t xml:space="preserve">(1), 195–203. http://doi.org/</w:t>
       </w:r>
-      <w:hyperlink r:id="rId172">
+      <w:hyperlink r:id="rId213">
         <w:r>
           <w:rPr>
             <w:rStyle w:val="Hyperlink"/>
@@ -19594,8 +19600,8 @@
         </w:r>
       </w:hyperlink>
     </w:p>
-    <w:bookmarkEnd w:id="173"/>
-    <w:bookmarkStart w:id="174" w:name="ref-plonsky2014big"/>
+    <w:bookmarkEnd w:id="214"/>
+    <w:bookmarkStart w:id="215" w:name="ref-plonsky2014big"/>
     <w:p>
       <w:pPr>
         <w:pStyle w:val="Bibliography"/>
@@ -19639,8 +19645,8 @@
         <w:t xml:space="preserve">(4), 878–912.</w:t>
       </w:r>
     </w:p>
-    <w:bookmarkEnd w:id="174"/>
-    <w:bookmarkStart w:id="176" w:name="ref-poarch_vanhell_2014"/>
+    <w:bookmarkEnd w:id="215"/>
+    <w:bookmarkStart w:id="217" w:name="ref-poarch_vanhell_2014"/>
     <w:p>
       <w:pPr>
         <w:pStyle w:val="Bibliography"/>
@@ -19674,7 +19680,7 @@
       <w:r>
         <w:t xml:space="preserve">(6), 693–716. http://doi.org/</w:t>
       </w:r>
-      <w:hyperlink r:id="rId175">
+      <w:hyperlink r:id="rId216">
         <w:r>
           <w:rPr>
             <w:rStyle w:val="Hyperlink"/>
@@ -19683,8 +19689,8 @@
         </w:r>
       </w:hyperlink>
     </w:p>
-    <w:bookmarkEnd w:id="176"/>
-    <w:bookmarkStart w:id="178" w:name="ref-poort_rodd_2017"/>
+    <w:bookmarkEnd w:id="217"/>
+    <w:bookmarkStart w:id="219" w:name="ref-poort_rodd_2017"/>
     <w:p>
       <w:pPr>
         <w:pStyle w:val="Bibliography"/>
@@ -19718,7 +19724,7 @@
       <w:r>
         <w:t xml:space="preserve">, 52–63. http://doi.org/</w:t>
       </w:r>
-      <w:hyperlink r:id="rId177">
+      <w:hyperlink r:id="rId218">
         <w:r>
           <w:rPr>
             <w:rStyle w:val="Hyperlink"/>
@@ -19727,8 +19733,8 @@
         </w:r>
       </w:hyperlink>
     </w:p>
-    <w:bookmarkEnd w:id="178"/>
-    <w:bookmarkStart w:id="180" w:name="ref-puig-mayenco_etal_2020"/>
+    <w:bookmarkEnd w:id="219"/>
+    <w:bookmarkStart w:id="221" w:name="ref-puig-mayenco_etal_2020"/>
     <w:p>
       <w:pPr>
         <w:pStyle w:val="Bibliography"/>
@@ -19762,7 +19768,7 @@
       <w:r>
         <w:t xml:space="preserve">(1), 31–64. http://doi.org/</w:t>
       </w:r>
-      <w:hyperlink r:id="rId179">
+      <w:hyperlink r:id="rId220">
         <w:r>
           <w:rPr>
             <w:rStyle w:val="Hyperlink"/>
@@ -19771,8 +19777,8 @@
         </w:r>
       </w:hyperlink>
     </w:p>
-    <w:bookmarkEnd w:id="180"/>
-    <w:bookmarkStart w:id="181" w:name="ref-puig2020systematic"/>
+    <w:bookmarkEnd w:id="221"/>
+    <w:bookmarkStart w:id="222" w:name="ref-puig2020systematic"/>
     <w:p>
       <w:pPr>
         <w:pStyle w:val="Bibliography"/>
@@ -19807,8 +19813,8 @@
         <w:t xml:space="preserve">(1), 31–64.</w:t>
       </w:r>
     </w:p>
-    <w:bookmarkEnd w:id="181"/>
-    <w:bookmarkStart w:id="182" w:name="ref-puig2018language"/>
+    <w:bookmarkEnd w:id="222"/>
+    <w:bookmarkStart w:id="223" w:name="ref-puig2018language"/>
     <w:p>
       <w:pPr>
         <w:pStyle w:val="Bibliography"/>
@@ -19830,8 +19836,8 @@
         <w:t xml:space="preserve">, 229–260.</w:t>
       </w:r>
     </w:p>
-    <w:bookmarkEnd w:id="182"/>
-    <w:bookmarkStart w:id="183" w:name="ref-Rothman_2011"/>
+    <w:bookmarkEnd w:id="223"/>
+    <w:bookmarkStart w:id="224" w:name="ref-Rothman_2011"/>
     <w:p>
       <w:pPr>
         <w:pStyle w:val="Bibliography"/>
@@ -19866,8 +19872,8 @@
         <w:t xml:space="preserve">(1), 107–127.</w:t>
       </w:r>
     </w:p>
-    <w:bookmarkEnd w:id="183"/>
-    <w:bookmarkStart w:id="184" w:name="ref-Rothman_2015"/>
+    <w:bookmarkEnd w:id="224"/>
+    <w:bookmarkStart w:id="225" w:name="ref-Rothman_2015"/>
     <w:p>
       <w:pPr>
         <w:pStyle w:val="Bibliography"/>
@@ -19902,8 +19908,8 @@
         <w:t xml:space="preserve">(2), 179–190.</w:t>
       </w:r>
     </w:p>
-    <w:bookmarkEnd w:id="184"/>
-    <w:bookmarkStart w:id="185" w:name="ref-rothman2019third"/>
+    <w:bookmarkEnd w:id="225"/>
+    <w:bookmarkStart w:id="226" w:name="ref-rothman2019third"/>
     <w:p>
       <w:pPr>
         <w:pStyle w:val="Bibliography"/>
@@ -19928,8 +19934,8 @@
         <w:t xml:space="preserve">(Vol. 163). Cambridge University Press.</w:t>
       </w:r>
     </w:p>
-    <w:bookmarkEnd w:id="185"/>
-    <w:bookmarkStart w:id="186" w:name="ref-slabakova2017scalpel"/>
+    <w:bookmarkEnd w:id="226"/>
+    <w:bookmarkStart w:id="227" w:name="ref-slabakova2017scalpel"/>
     <w:p>
       <w:pPr>
         <w:pStyle w:val="Bibliography"/>
@@ -19964,8 +19970,8 @@
         <w:t xml:space="preserve">(6), 651–665.</w:t>
       </w:r>
     </w:p>
-    <w:bookmarkEnd w:id="186"/>
-    <w:bookmarkStart w:id="187" w:name="ref-model2023l3"/>
+    <w:bookmarkEnd w:id="227"/>
+    <w:bookmarkStart w:id="228" w:name="ref-model2023l3"/>
     <w:p>
       <w:pPr>
         <w:pStyle w:val="Bibliography"/>
@@ -19987,8 +19993,8 @@
         <w:t xml:space="preserve">, 1.</w:t>
       </w:r>
     </w:p>
-    <w:bookmarkEnd w:id="187"/>
-    <w:bookmarkStart w:id="189" w:name="ref-szubko-sitarek_2011"/>
+    <w:bookmarkEnd w:id="228"/>
+    <w:bookmarkStart w:id="230" w:name="ref-szubko-sitarek_2011"/>
     <w:p>
       <w:pPr>
         <w:pStyle w:val="Bibliography"/>
@@ -20022,7 +20028,7 @@
       <w:r>
         <w:t xml:space="preserve">(2), 189–208. http://doi.org/</w:t>
       </w:r>
-      <w:hyperlink r:id="rId188">
+      <w:hyperlink r:id="rId229">
         <w:r>
           <w:rPr>
             <w:rStyle w:val="Hyperlink"/>
@@ -20031,8 +20037,8 @@
         </w:r>
       </w:hyperlink>
     </w:p>
-    <w:bookmarkEnd w:id="189"/>
-    <w:bookmarkStart w:id="191" w:name="ref-tiffin-richards_2024"/>
+    <w:bookmarkEnd w:id="230"/>
+    <w:bookmarkStart w:id="232" w:name="ref-tiffin-richards_2024"/>
     <w:p>
       <w:pPr>
         <w:pStyle w:val="Bibliography"/>
@@ -20078,7 +20084,7 @@
       <w:r>
         <w:t xml:space="preserve">(5), 964–981. http://doi.org/</w:t>
       </w:r>
-      <w:hyperlink r:id="rId190">
+      <w:hyperlink r:id="rId231">
         <w:r>
           <w:rPr>
             <w:rStyle w:val="Hyperlink"/>
@@ -20087,8 +20093,8 @@
         </w:r>
       </w:hyperlink>
     </w:p>
-    <w:bookmarkEnd w:id="191"/>
-    <w:bookmarkStart w:id="193" w:name="ref-tonzar_etal_2009"/>
+    <w:bookmarkEnd w:id="232"/>
+    <w:bookmarkStart w:id="234" w:name="ref-tonzar_etal_2009"/>
     <w:p>
       <w:pPr>
         <w:pStyle w:val="Bibliography"/>
@@ -20194,7 +20200,7 @@
       <w:r>
         <w:t xml:space="preserve">(3), 623–646. http://doi.org/</w:t>
       </w:r>
-      <w:hyperlink r:id="rId192">
+      <w:hyperlink r:id="rId233">
         <w:r>
           <w:rPr>
             <w:rStyle w:val="Hyperlink"/>
@@ -20203,8 +20209,8 @@
         </w:r>
       </w:hyperlink>
     </w:p>
-    <w:bookmarkEnd w:id="193"/>
-    <w:bookmarkStart w:id="195" w:name="ref-UNESCO2025MultilingualEducation"/>
+    <w:bookmarkEnd w:id="234"/>
+    <w:bookmarkStart w:id="236" w:name="ref-UNESCO2025MultilingualEducation"/>
     <w:p>
       <w:pPr>
         <w:pStyle w:val="Bibliography"/>
@@ -20215,7 +20221,7 @@
       <w:r>
         <w:t xml:space="preserve"> </w:t>
       </w:r>
-      <w:hyperlink r:id="rId194">
+      <w:hyperlink r:id="rId235">
         <w:r>
           <w:rPr>
             <w:rStyle w:val="Hyperlink"/>
@@ -20224,8 +20230,8 @@
         </w:r>
       </w:hyperlink>
     </w:p>
-    <w:bookmarkEnd w:id="195"/>
-    <w:bookmarkStart w:id="196" w:name="ref-westergaard2017crosslinguistic"/>
+    <w:bookmarkEnd w:id="236"/>
+    <w:bookmarkStart w:id="237" w:name="ref-westergaard2017crosslinguistic"/>
     <w:p>
       <w:pPr>
         <w:pStyle w:val="Bibliography"/>
@@ -20260,8 +20266,8 @@
         <w:t xml:space="preserve">(6), 666–682.</w:t>
       </w:r>
     </w:p>
-    <w:bookmarkEnd w:id="196"/>
-    <w:bookmarkStart w:id="198" w:name="ref-woumans_etal_2021"/>
+    <w:bookmarkEnd w:id="237"/>
+    <w:bookmarkStart w:id="239" w:name="ref-woumans_etal_2021"/>
     <w:p>
       <w:pPr>
         <w:pStyle w:val="Bibliography"/>
@@ -20349,7 +20355,7 @@
       <w:r>
         <w:t xml:space="preserve">, 647362. http://doi.org/</w:t>
       </w:r>
-      <w:hyperlink r:id="rId197">
+      <w:hyperlink r:id="rId238">
         <w:r>
           <w:rPr>
             <w:rStyle w:val="Hyperlink"/>
@@ -20358,16 +20364,16 @@
         </w:r>
       </w:hyperlink>
     </w:p>
-    <w:bookmarkEnd w:id="198"/>
-    <w:bookmarkEnd w:id="199"/>
-    <w:bookmarkEnd w:id="200"/>
+    <w:bookmarkEnd w:id="239"/>
+    <w:bookmarkEnd w:id="240"/>
+    <w:bookmarkEnd w:id="241"/>
     <w:sectPr>
-      <w:headerReference r:id="rId9" w:type="even"/>
-      <w:headerReference r:id="rId10" w:type="default"/>
-      <w:footerReference r:id="rId14" w:type="even"/>
-      <w:footerReference r:id="rId12" w:type="default"/>
-      <w:headerReference r:id="rId11" w:type="first"/>
-      <w:footerReference r:id="rId13" w:type="first"/>
+      <w:headerReference r:id="rId47" w:type="even"/>
+      <w:headerReference r:id="rId48" w:type="default"/>
+      <w:footerReference r:id="rId49" w:type="even"/>
+      <w:footerReference r:id="rId50" w:type="default"/>
+      <w:headerReference r:id="rId51" w:type="first"/>
+      <w:footerReference r:id="rId52" w:type="first"/>
       <w:pgSz w:h="15840" w:w="12240"/>
       <w:pgMar w:bottom="1440" w:footer="720" w:gutter="0" w:header="720" w:left="1440" w:right="1440" w:top="1440"/>
       <w:cols w:space="720"/>

</xml_diff>